<commit_message>
Rebrand product as Samal Journeys for Saryarqa Routes
</commit_message>
<xml_diff>
--- a/deliverables/TeamName_TechnologyProduct.docx
+++ b/deliverables/TeamName_TechnologyProduct.docx
@@ -7,7 +7,16 @@
         <w:pStyle w:val="Title"/>
       </w:pPr>
       <w:r>
-        <w:t>QazaqPass Technology Product Proposal</w:t>
+        <w:t>Samal Journeys</w:t>
+      </w:r>
+    </w:p>
+    <w:p>
+      <w:pPr>
+        <w:pStyle w:val="Subtitle"/>
+        <w:widowControl/>
+      </w:pPr>
+      <w:r>
+        <w:t>Technology Product Proposal for Saryarqa Routes</w:t>
       </w:r>
     </w:p>
     <w:p>
@@ -34,7 +43,7 @@
         <w:widowControl/>
       </w:pPr>
       <w:r>
-        <w:t>AI-assisted working draft for substantive team review. QazaqPass is a proposed browser application for Saryarqa Routes that connects tour matching, transparent trip information, booking and operator follow-up. The recommended pilot is a narrow India-resident segment; commercial demand, user benefit and production readiness remain unproven.</w:t>
+        <w:t>AI-assisted working draft for substantive team review. Samal Journeys is a proposed browser application for Saryarqa Routes that connects tour matching, transparent trip information, booking and operator follow-up. The recommended pilot is a narrow India-resident segment; commercial demand, user benefit and production readiness remain unproven.</w:t>
       </w:r>
     </w:p>
     <w:p>
@@ -98,7 +107,7 @@
           <w:tcPr>
             <w:tcW w:type="dxa" w:w="1480"/>
             <w:vAlign w:val="center"/>
-            <w:shd w:fill="E5EDF0"/>
+            <w:shd w:fill="304D43"/>
             <w:tcMar>
               <w:top w:w="75" w:type="dxa"/>
               <w:left w:w="75" w:type="dxa"/>
@@ -113,6 +122,7 @@
             <w:r>
               <w:rPr>
                 <w:b/>
+                <w:color w:val="FFFFFF"/>
                 <w:sz w:val="17"/>
               </w:rPr>
               <w:t>Country</w:t>
@@ -123,7 +133,7 @@
           <w:tcPr>
             <w:tcW w:type="dxa" w:w="2170"/>
             <w:vAlign w:val="center"/>
-            <w:shd w:fill="E5EDF0"/>
+            <w:shd w:fill="304D43"/>
             <w:tcMar>
               <w:top w:w="75" w:type="dxa"/>
               <w:left w:w="75" w:type="dxa"/>
@@ -138,6 +148,7 @@
             <w:r>
               <w:rPr>
                 <w:b/>
+                <w:color w:val="FFFFFF"/>
                 <w:sz w:val="17"/>
               </w:rPr>
               <w:t>Accommodation guests</w:t>
@@ -148,7 +159,7 @@
           <w:tcPr>
             <w:tcW w:type="dxa" w:w="6215"/>
             <w:vAlign w:val="center"/>
-            <w:shd w:fill="E5EDF0"/>
+            <w:shd w:fill="304D43"/>
             <w:tcMar>
               <w:top w:w="75" w:type="dxa"/>
               <w:left w:w="75" w:type="dxa"/>
@@ -163,6 +174,7 @@
             <w:r>
               <w:rPr>
                 <w:b/>
+                <w:color w:val="FFFFFF"/>
                 <w:sz w:val="17"/>
               </w:rPr>
               <w:t>Pilot judgment</w:t>
@@ -178,7 +190,7 @@
           <w:tcPr>
             <w:tcW w:type="dxa" w:w="1480"/>
             <w:vAlign w:val="center"/>
-            <w:shd w:fill="F8FAFA"/>
+            <w:shd w:fill="F5F1EA"/>
             <w:tcMar>
               <w:top w:w="75" w:type="dxa"/>
               <w:left w:w="75" w:type="dxa"/>
@@ -193,6 +205,7 @@
             <w:r>
               <w:rPr>
                 <w:b w:val="0"/>
+                <w:color w:val="1C1F22"/>
                 <w:sz w:val="17"/>
               </w:rPr>
               <w:t>China</w:t>
@@ -203,7 +216,7 @@
           <w:tcPr>
             <w:tcW w:type="dxa" w:w="2170"/>
             <w:vAlign w:val="center"/>
-            <w:shd w:fill="F8FAFA"/>
+            <w:shd w:fill="F5F1EA"/>
             <w:tcMar>
               <w:top w:w="75" w:type="dxa"/>
               <w:left w:w="75" w:type="dxa"/>
@@ -218,6 +231,7 @@
             <w:r>
               <w:rPr>
                 <w:b w:val="0"/>
+                <w:color w:val="1C1F22"/>
                 <w:sz w:val="17"/>
               </w:rPr>
               <w:t>127,059</w:t>
@@ -228,7 +242,7 @@
           <w:tcPr>
             <w:tcW w:type="dxa" w:w="6215"/>
             <w:vAlign w:val="center"/>
-            <w:shd w:fill="F8FAFA"/>
+            <w:shd w:fill="F5F1EA"/>
             <w:tcMar>
               <w:top w:w="75" w:type="dxa"/>
               <w:left w:w="75" w:type="dxa"/>
@@ -243,6 +257,7 @@
             <w:r>
               <w:rPr>
                 <w:b w:val="0"/>
+                <w:color w:val="1C1F22"/>
                 <w:sz w:val="17"/>
               </w:rPr>
               <w:t>Largest flow here; language and channel fit require separate research.</w:t>
@@ -258,7 +273,7 @@
           <w:tcPr>
             <w:tcW w:type="dxa" w:w="1480"/>
             <w:vAlign w:val="center"/>
-            <w:shd w:fill="FFFFFF"/>
+            <w:shd w:fill="FDFBF7"/>
             <w:tcMar>
               <w:top w:w="75" w:type="dxa"/>
               <w:left w:w="75" w:type="dxa"/>
@@ -273,6 +288,7 @@
             <w:r>
               <w:rPr>
                 <w:b w:val="0"/>
+                <w:color w:val="1C1F22"/>
                 <w:sz w:val="17"/>
               </w:rPr>
               <w:t>India</w:t>
@@ -283,7 +299,7 @@
           <w:tcPr>
             <w:tcW w:type="dxa" w:w="2170"/>
             <w:vAlign w:val="center"/>
-            <w:shd w:fill="FFFFFF"/>
+            <w:shd w:fill="FDFBF7"/>
             <w:tcMar>
               <w:top w:w="75" w:type="dxa"/>
               <w:left w:w="75" w:type="dxa"/>
@@ -298,6 +314,7 @@
             <w:r>
               <w:rPr>
                 <w:b w:val="0"/>
+                <w:color w:val="1C1F22"/>
                 <w:sz w:val="17"/>
               </w:rPr>
               <w:t>91,148</w:t>
@@ -308,7 +325,7 @@
           <w:tcPr>
             <w:tcW w:type="dxa" w:w="6215"/>
             <w:vAlign w:val="center"/>
-            <w:shd w:fill="FFFFFF"/>
+            <w:shd w:fill="FDFBF7"/>
             <w:tcMar>
               <w:top w:w="75" w:type="dxa"/>
               <w:left w:w="75" w:type="dxa"/>
@@ -323,6 +340,7 @@
             <w:r>
               <w:rPr>
                 <w:b w:val="0"/>
+                <w:color w:val="1C1F22"/>
                 <w:sz w:val="17"/>
               </w:rPr>
               <w:t>Proposed pilot; official access evidence supports a focused test.</w:t>
@@ -338,7 +356,7 @@
           <w:tcPr>
             <w:tcW w:type="dxa" w:w="1480"/>
             <w:vAlign w:val="center"/>
-            <w:shd w:fill="F8FAFA"/>
+            <w:shd w:fill="F5F1EA"/>
             <w:tcMar>
               <w:top w:w="75" w:type="dxa"/>
               <w:left w:w="75" w:type="dxa"/>
@@ -353,6 +371,7 @@
             <w:r>
               <w:rPr>
                 <w:b w:val="0"/>
+                <w:color w:val="1C1F22"/>
                 <w:sz w:val="17"/>
               </w:rPr>
               <w:t>Germany</w:t>
@@ -363,7 +382,7 @@
           <w:tcPr>
             <w:tcW w:type="dxa" w:w="2170"/>
             <w:vAlign w:val="center"/>
-            <w:shd w:fill="F8FAFA"/>
+            <w:shd w:fill="F5F1EA"/>
             <w:tcMar>
               <w:top w:w="75" w:type="dxa"/>
               <w:left w:w="75" w:type="dxa"/>
@@ -378,6 +397,7 @@
             <w:r>
               <w:rPr>
                 <w:b w:val="0"/>
+                <w:color w:val="1C1F22"/>
                 <w:sz w:val="17"/>
               </w:rPr>
               <w:t>24,672</w:t>
@@ -388,7 +408,7 @@
           <w:tcPr>
             <w:tcW w:type="dxa" w:w="6215"/>
             <w:vAlign w:val="center"/>
-            <w:shd w:fill="F8FAFA"/>
+            <w:shd w:fill="F5F1EA"/>
             <w:tcMar>
               <w:top w:w="75" w:type="dxa"/>
               <w:left w:w="75" w:type="dxa"/>
@@ -403,6 +423,7 @@
             <w:r>
               <w:rPr>
                 <w:b w:val="0"/>
+                <w:color w:val="1C1F22"/>
                 <w:sz w:val="17"/>
               </w:rPr>
               <w:t>Credible alternative; smaller flow, customer value unmeasured.</w:t>
@@ -458,7 +479,7 @@
         <w:widowControl/>
       </w:pPr>
       <w:r>
-        <w:t>QazaqPass should be assessed against configuring existing tools. The following vendor evidence identifies useful capabilities and unresolved fit, not proven competitor weaknesses. [S04-S05]</w:t>
+        <w:t>Samal Journeys should be assessed against configuring existing tools. The following vendor evidence identifies useful capabilities and unresolved fit, not proven competitor weaknesses. [S04-S05]</w:t>
       </w:r>
     </w:p>
     <w:tbl>
@@ -490,7 +511,7 @@
           <w:tcPr>
             <w:tcW w:type="dxa" w:w="1973"/>
             <w:vAlign w:val="center"/>
-            <w:shd w:fill="E5EDF0"/>
+            <w:shd w:fill="304D43"/>
             <w:tcMar>
               <w:top w:w="75" w:type="dxa"/>
               <w:left w:w="75" w:type="dxa"/>
@@ -505,6 +526,7 @@
             <w:r>
               <w:rPr>
                 <w:b/>
+                <w:color w:val="FFFFFF"/>
                 <w:sz w:val="17"/>
               </w:rPr>
               <w:t>Dimension</w:t>
@@ -515,7 +537,7 @@
           <w:tcPr>
             <w:tcW w:type="dxa" w:w="3946"/>
             <w:vAlign w:val="center"/>
-            <w:shd w:fill="E5EDF0"/>
+            <w:shd w:fill="304D43"/>
             <w:tcMar>
               <w:top w:w="75" w:type="dxa"/>
               <w:left w:w="75" w:type="dxa"/>
@@ -530,6 +552,7 @@
             <w:r>
               <w:rPr>
                 <w:b/>
+                <w:color w:val="FFFFFF"/>
                 <w:sz w:val="17"/>
               </w:rPr>
               <w:t>Viator marketplace</w:t>
@@ -540,7 +563,7 @@
           <w:tcPr>
             <w:tcW w:type="dxa" w:w="3946"/>
             <w:vAlign w:val="center"/>
-            <w:shd w:fill="E5EDF0"/>
+            <w:shd w:fill="304D43"/>
             <w:tcMar>
               <w:top w:w="75" w:type="dxa"/>
               <w:left w:w="75" w:type="dxa"/>
@@ -555,6 +578,7 @@
             <w:r>
               <w:rPr>
                 <w:b/>
+                <w:color w:val="FFFFFF"/>
                 <w:sz w:val="17"/>
               </w:rPr>
               <w:t>Bokun operator software</w:t>
@@ -570,7 +594,7 @@
           <w:tcPr>
             <w:tcW w:type="dxa" w:w="1973"/>
             <w:vAlign w:val="center"/>
-            <w:shd w:fill="F8FAFA"/>
+            <w:shd w:fill="F5F1EA"/>
             <w:tcMar>
               <w:top w:w="75" w:type="dxa"/>
               <w:left w:w="75" w:type="dxa"/>
@@ -585,6 +609,7 @@
             <w:r>
               <w:rPr>
                 <w:b w:val="0"/>
+                <w:color w:val="1C1F22"/>
                 <w:sz w:val="17"/>
               </w:rPr>
               <w:t>Discovery and journey</w:t>
@@ -595,7 +620,7 @@
           <w:tcPr>
             <w:tcW w:type="dxa" w:w="3946"/>
             <w:vAlign w:val="center"/>
-            <w:shd w:fill="F8FAFA"/>
+            <w:shd w:fill="F5F1EA"/>
             <w:tcMar>
               <w:top w:w="75" w:type="dxa"/>
               <w:left w:w="75" w:type="dxa"/>
@@ -610,6 +635,7 @@
             <w:r>
               <w:rPr>
                 <w:b w:val="0"/>
+                <w:color w:val="1C1F22"/>
                 <w:sz w:val="17"/>
               </w:rPr>
               <w:t>Marketplace distribution; customer booking and payment.</w:t>
@@ -620,7 +646,7 @@
           <w:tcPr>
             <w:tcW w:type="dxa" w:w="3946"/>
             <w:vAlign w:val="center"/>
-            <w:shd w:fill="F8FAFA"/>
+            <w:shd w:fill="F5F1EA"/>
             <w:tcMar>
               <w:top w:w="75" w:type="dxa"/>
               <w:left w:w="75" w:type="dxa"/>
@@ -635,6 +661,7 @@
             <w:r>
               <w:rPr>
                 <w:b w:val="0"/>
+                <w:color w:val="1C1F22"/>
                 <w:sz w:val="17"/>
               </w:rPr>
               <w:t>Direct booking widgets plus OTA and marketplace channels.</w:t>
@@ -650,7 +677,7 @@
           <w:tcPr>
             <w:tcW w:type="dxa" w:w="1973"/>
             <w:vAlign w:val="center"/>
-            <w:shd w:fill="FFFFFF"/>
+            <w:shd w:fill="FDFBF7"/>
             <w:tcMar>
               <w:top w:w="75" w:type="dxa"/>
               <w:left w:w="75" w:type="dxa"/>
@@ -665,6 +692,7 @@
             <w:r>
               <w:rPr>
                 <w:b w:val="0"/>
+                <w:color w:val="1C1F22"/>
                 <w:sz w:val="17"/>
               </w:rPr>
               <w:t>Transparency and control</w:t>
@@ -675,7 +703,7 @@
           <w:tcPr>
             <w:tcW w:type="dxa" w:w="3946"/>
             <w:vAlign w:val="center"/>
-            <w:shd w:fill="FFFFFF"/>
+            <w:shd w:fill="FDFBF7"/>
             <w:tcMar>
               <w:top w:w="75" w:type="dxa"/>
               <w:left w:w="75" w:type="dxa"/>
@@ -690,6 +718,7 @@
             <w:r>
               <w:rPr>
                 <w:b w:val="0"/>
+                <w:color w:val="1C1F22"/>
                 <w:sz w:val="17"/>
               </w:rPr>
               <w:t>Operator controls listing content, retail price and availability; submission review.</w:t>
@@ -700,7 +729,7 @@
           <w:tcPr>
             <w:tcW w:type="dxa" w:w="3946"/>
             <w:vAlign w:val="center"/>
-            <w:shd w:fill="FFFFFF"/>
+            <w:shd w:fill="FDFBF7"/>
             <w:tcMar>
               <w:top w:w="75" w:type="dxa"/>
               <w:left w:w="75" w:type="dxa"/>
@@ -715,6 +744,7 @@
             <w:r>
               <w:rPr>
                 <w:b w:val="0"/>
+                <w:color w:val="1C1F22"/>
                 <w:sz w:val="17"/>
               </w:rPr>
               <w:t>Operator manages product content, availability, resources and payment links.</w:t>
@@ -730,7 +760,7 @@
           <w:tcPr>
             <w:tcW w:type="dxa" w:w="1973"/>
             <w:vAlign w:val="center"/>
-            <w:shd w:fill="F8FAFA"/>
+            <w:shd w:fill="F5F1EA"/>
             <w:tcMar>
               <w:top w:w="75" w:type="dxa"/>
               <w:left w:w="75" w:type="dxa"/>
@@ -745,6 +775,7 @@
             <w:r>
               <w:rPr>
                 <w:b w:val="0"/>
+                <w:color w:val="1C1F22"/>
                 <w:sz w:val="17"/>
               </w:rPr>
               <w:t>Payment and operations</w:t>
@@ -755,7 +786,7 @@
           <w:tcPr>
             <w:tcW w:type="dxa" w:w="3946"/>
             <w:vAlign w:val="center"/>
-            <w:shd w:fill="F8FAFA"/>
+            <w:shd w:fill="F5F1EA"/>
             <w:tcMar>
               <w:top w:w="75" w:type="dxa"/>
               <w:left w:w="75" w:type="dxa"/>
@@ -770,6 +801,7 @@
             <w:r>
               <w:rPr>
                 <w:b w:val="0"/>
+                <w:color w:val="1C1F22"/>
                 <w:sz w:val="17"/>
               </w:rPr>
               <w:t>Vendor handles payments/refunds; pays after experience. Kazakhstan payout eligibility unverified.</w:t>
@@ -780,7 +812,7 @@
           <w:tcPr>
             <w:tcW w:type="dxa" w:w="3946"/>
             <w:vAlign w:val="center"/>
-            <w:shd w:fill="F8FAFA"/>
+            <w:shd w:fill="F5F1EA"/>
             <w:tcMar>
               <w:top w:w="75" w:type="dxa"/>
               <w:left w:w="75" w:type="dxa"/>
@@ -795,6 +827,7 @@
             <w:r>
               <w:rPr>
                 <w:b w:val="0"/>
+                <w:color w:val="1C1F22"/>
                 <w:sz w:val="17"/>
               </w:rPr>
               <w:t>Booking and channel management; Kazakhstan gateway suitability and Halyk connection unverified.</w:t>
@@ -810,7 +843,7 @@
           <w:tcPr>
             <w:tcW w:type="dxa" w:w="1973"/>
             <w:vAlign w:val="center"/>
-            <w:shd w:fill="FFFFFF"/>
+            <w:shd w:fill="FDFBF7"/>
             <w:tcMar>
               <w:top w:w="75" w:type="dxa"/>
               <w:left w:w="75" w:type="dxa"/>
@@ -825,6 +858,7 @@
             <w:r>
               <w:rPr>
                 <w:b w:val="0"/>
+                <w:color w:val="1C1F22"/>
                 <w:sz w:val="17"/>
               </w:rPr>
               <w:t>Cost and effort</w:t>
@@ -835,7 +869,7 @@
           <w:tcPr>
             <w:tcW w:type="dxa" w:w="3946"/>
             <w:vAlign w:val="center"/>
-            <w:shd w:fill="FFFFFF"/>
+            <w:shd w:fill="FDFBF7"/>
             <w:tcMar>
               <w:top w:w="75" w:type="dxa"/>
               <w:left w:w="75" w:type="dxa"/>
@@ -850,6 +884,7 @@
             <w:r>
               <w:rPr>
                 <w:b w:val="0"/>
+                <w:color w:val="1C1F22"/>
                 <w:sz w:val="17"/>
               </w:rPr>
               <w:t>USD29 per submitted product plus completed-booking commission; exact rate needs contract. Listings need preparation.</w:t>
@@ -860,7 +895,7 @@
           <w:tcPr>
             <w:tcW w:type="dxa" w:w="3946"/>
             <w:vAlign w:val="center"/>
-            <w:shd w:fill="FFFFFF"/>
+            <w:shd w:fill="FDFBF7"/>
             <w:tcMar>
               <w:top w:w="75" w:type="dxa"/>
               <w:left w:w="75" w:type="dxa"/>
@@ -875,6 +910,7 @@
             <w:r>
               <w:rPr>
                 <w:b w:val="0"/>
+                <w:color w:val="1C1F22"/>
                 <w:sz w:val="17"/>
               </w:rPr>
               <w:t>START USD49/month plus 1.5% applicable-booking fee, up to five users; setup and payment fees may be additional.</w:t>
@@ -916,8 +952,8 @@
       <w:r>
         <w:drawing>
           <wp:inline xmlns:a="http://schemas.openxmlformats.org/drawingml/2006/main" xmlns:pic="http://schemas.openxmlformats.org/drawingml/2006/picture">
-            <wp:extent cx="5511398" cy="3780000"/>
-            <wp:docPr id="1" name="Picture 1" descr="Figure 1. Trip Truth Card excerpt from a genuine local browser capture. Prices, dates and policies are demonstration data."/>
+            <wp:extent cx="5443200" cy="3780000"/>
+            <wp:docPr id="1" name="Picture 1" descr="Figure 1. Samal Journeys Trip Truth Card in the running local application. Price, dates and policies are demonstration data. Genuine browser capture, 23 October 2026."/>
             <wp:cNvGraphicFramePr>
               <a:graphicFrameLocks noChangeAspect="1"/>
             </wp:cNvGraphicFramePr>
@@ -925,7 +961,7 @@
               <a:graphicData uri="http://schemas.openxmlformats.org/drawingml/2006/picture">
                 <pic:pic>
                   <pic:nvPicPr>
-                    <pic:cNvPr id="0" name="report-truth-card.png"/>
+                    <pic:cNvPr id="0" name="desktop-truth-card.png"/>
                     <pic:cNvPicPr/>
                   </pic:nvPicPr>
                   <pic:blipFill>
@@ -937,7 +973,7 @@
                   <pic:spPr>
                     <a:xfrm>
                       <a:off x="0" y="0"/>
-                      <a:ext cx="5511398" cy="3780000"/>
+                      <a:ext cx="5443200" cy="3780000"/>
                     </a:xfrm>
                     <a:prstGeom prst="rect"/>
                   </pic:spPr>
@@ -953,7 +989,7 @@
         <w:pStyle w:val="Caption"/>
       </w:pPr>
       <w:r>
-        <w:t>Figure 1. Trip Truth Card excerpt from a genuine local browser capture. Prices, dates and policies are demonstration data.</w:t>
+        <w:t>Figure 1. Samal Journeys Trip Truth Card in the running local application. Price, dates and policies are demonstration data. Genuine browser capture, 23 October 2026.</w:t>
       </w:r>
     </w:p>
     <w:p>
@@ -1018,7 +1054,7 @@
         <w:widowControl/>
       </w:pPr>
       <w:r>
-        <w:t>The five capabilities are catalog matching, Trip Truth Card, guided booking, Trip Passport and operator workspace. A traveler enters dates, party size, budget, starting city, interests and difficulty; only compatible catalog departures are recommended. The same card feeds departure selection, synthetic details and total review. A confirmed simulation creates a reference and Passport; pending, declined and cancelled outcomes remain separate. Operator controls support catalog, capacity, guide status and follow-up. Prices and eligibility are deterministic; unanswered questions need a person, not an invented itinerary or certification.</w:t>
+        <w:t>The five capabilities are catalog matching, Trip Truth Card, guided booking, Trip Passport and operator workspace. Matching uses dates, party size, budget, city, interests and difficulty to return compatible departures. Checkout preserves traveler drafts when navigating or reloading, and requests fresh consent when accepted terms change. Only simulated success confirms a Passport; pending, declined and cancelled remain distinct. Operators can author tours, edit content and future capacity, assign guides and answer private traveler questions. The Passport preserves accepted price and policy snapshots after catalog edits. Answers come from the operator; the product does not invent itinerary details or credentials.</w:t>
       </w:r>
     </w:p>
     <w:p>
@@ -1034,7 +1070,7 @@
         <w:widowControl/>
       </w:pPr>
       <w:r>
-        <w:t>The supporting prototype uses Node 24.16, plain HTML/CSS/JavaScript and persistent local JSON with no npm dependencies, paid service or API key. It is a local demonstration, not the finished 12-week pilot. It has no live AI, live payment integration or service worker. Matching is rule based. Tour-specific prices, dates, capacity and policies are synthetic; guide assignment remains a recorded state, not an invented credential. Demo operator access is not suitable for public exposure.</w:t>
+        <w:t>The local prototype uses Node 24.16, HTML/CSS/JavaScript and persistent JSON, with no npm dependencies or API key. It has no live AI, real payments or service worker. Its dedicated presentation mode seeds future dates and can reset its own backed-up store. The warm editorial interface uses local fonts, licensed destination photographs without effects and responsive navigation. Tour prices, policies, capacity and traveler records are synthetic; guide assignment records a state, not a verified credential. Demo operator access is unsuitable for public exposure.</w:t>
       </w:r>
     </w:p>
     <w:p>
@@ -1119,7 +1155,7 @@
           <w:tcPr>
             <w:tcW w:type="dxa" w:w="986"/>
             <w:vAlign w:val="center"/>
-            <w:shd w:fill="E5EDF0"/>
+            <w:shd w:fill="304D43"/>
             <w:tcMar>
               <w:top w:w="75" w:type="dxa"/>
               <w:left w:w="75" w:type="dxa"/>
@@ -1134,6 +1170,7 @@
             <w:r>
               <w:rPr>
                 <w:b/>
+                <w:color w:val="FFFFFF"/>
                 <w:sz w:val="17"/>
               </w:rPr>
               <w:t>Weeks</w:t>
@@ -1144,7 +1181,7 @@
           <w:tcPr>
             <w:tcW w:type="dxa" w:w="4538"/>
             <w:vAlign w:val="center"/>
-            <w:shd w:fill="E5EDF0"/>
+            <w:shd w:fill="304D43"/>
             <w:tcMar>
               <w:top w:w="75" w:type="dxa"/>
               <w:left w:w="75" w:type="dxa"/>
@@ -1159,6 +1196,7 @@
             <w:r>
               <w:rPr>
                 <w:b/>
+                <w:color w:val="FFFFFF"/>
                 <w:sz w:val="17"/>
               </w:rPr>
               <w:t>Deliverables and owner</w:t>
@@ -1169,7 +1207,7 @@
           <w:tcPr>
             <w:tcW w:type="dxa" w:w="4340"/>
             <w:vAlign w:val="center"/>
-            <w:shd w:fill="E5EDF0"/>
+            <w:shd w:fill="304D43"/>
             <w:tcMar>
               <w:top w:w="75" w:type="dxa"/>
               <w:left w:w="75" w:type="dxa"/>
@@ -1184,6 +1222,7 @@
             <w:r>
               <w:rPr>
                 <w:b/>
+                <w:color w:val="FFFFFF"/>
                 <w:sz w:val="17"/>
               </w:rPr>
               <w:t>Dependency and acceptance gate</w:t>
@@ -1199,7 +1238,7 @@
           <w:tcPr>
             <w:tcW w:type="dxa" w:w="986"/>
             <w:vAlign w:val="center"/>
-            <w:shd w:fill="F8FAFA"/>
+            <w:shd w:fill="F5F1EA"/>
             <w:tcMar>
               <w:top w:w="75" w:type="dxa"/>
               <w:left w:w="75" w:type="dxa"/>
@@ -1214,6 +1253,7 @@
             <w:r>
               <w:rPr>
                 <w:b w:val="0"/>
+                <w:color w:val="1C1F22"/>
                 <w:sz w:val="17"/>
               </w:rPr>
               <w:t>1-2</w:t>
@@ -1224,7 +1264,7 @@
           <w:tcPr>
             <w:tcW w:type="dxa" w:w="4538"/>
             <w:vAlign w:val="center"/>
-            <w:shd w:fill="F8FAFA"/>
+            <w:shd w:fill="F5F1EA"/>
             <w:tcMar>
               <w:top w:w="75" w:type="dxa"/>
               <w:left w:w="75" w:type="dxa"/>
@@ -1239,6 +1279,7 @@
             <w:r>
               <w:rPr>
                 <w:b w:val="0"/>
+                <w:color w:val="1C1F22"/>
                 <w:sz w:val="17"/>
               </w:rPr>
               <w:t>Product/UX + operator: verify segment, audit catalog, compare build versus configure; start payment onboarding.</w:t>
@@ -1249,7 +1290,7 @@
           <w:tcPr>
             <w:tcW w:type="dxa" w:w="4340"/>
             <w:vAlign w:val="center"/>
-            <w:shd w:fill="F8FAFA"/>
+            <w:shd w:fill="F5F1EA"/>
             <w:tcMar>
               <w:top w:w="75" w:type="dxa"/>
               <w:left w:w="75" w:type="dxa"/>
@@ -1264,6 +1305,7 @@
             <w:r>
               <w:rPr>
                 <w:b w:val="0"/>
+                <w:color w:val="1C1F22"/>
                 <w:sz w:val="17"/>
               </w:rPr>
               <w:t>Team-owned strategy; approved sample Truth Card; merchant requirements received.</w:t>
@@ -1279,7 +1321,7 @@
           <w:tcPr>
             <w:tcW w:type="dxa" w:w="986"/>
             <w:vAlign w:val="center"/>
-            <w:shd w:fill="FFFFFF"/>
+            <w:shd w:fill="FDFBF7"/>
             <w:tcMar>
               <w:top w:w="75" w:type="dxa"/>
               <w:left w:w="75" w:type="dxa"/>
@@ -1294,6 +1336,7 @@
             <w:r>
               <w:rPr>
                 <w:b w:val="0"/>
+                <w:color w:val="1C1F22"/>
                 <w:sz w:val="17"/>
               </w:rPr>
               <w:t>3-4</w:t>
@@ -1304,7 +1347,7 @@
           <w:tcPr>
             <w:tcW w:type="dxa" w:w="4538"/>
             <w:vAlign w:val="center"/>
-            <w:shd w:fill="FFFFFF"/>
+            <w:shd w:fill="FDFBF7"/>
             <w:tcMar>
               <w:top w:w="75" w:type="dxa"/>
               <w:left w:w="75" w:type="dxa"/>
@@ -1319,6 +1362,7 @@
             <w:r>
               <w:rPr>
                 <w:b w:val="0"/>
+                <w:color w:val="1C1F22"/>
                 <w:sz w:val="17"/>
               </w:rPr>
               <w:t>Designer + engineer: matching, tour page, responsive layout, schema and inventory model.</w:t>
@@ -1329,7 +1373,7 @@
           <w:tcPr>
             <w:tcW w:type="dxa" w:w="4340"/>
             <w:vAlign w:val="center"/>
-            <w:shd w:fill="FFFFFF"/>
+            <w:shd w:fill="FDFBF7"/>
             <w:tcMar>
               <w:top w:w="75" w:type="dxa"/>
               <w:left w:w="75" w:type="dxa"/>
@@ -1344,6 +1388,7 @@
             <w:r>
               <w:rPr>
                 <w:b w:val="0"/>
+                <w:color w:val="1C1F22"/>
                 <w:sz w:val="17"/>
               </w:rPr>
               <w:t>Catalog content ready; no-match and price consistency pass; early comprehension tests.</w:t>
@@ -1359,7 +1404,7 @@
           <w:tcPr>
             <w:tcW w:type="dxa" w:w="986"/>
             <w:vAlign w:val="center"/>
-            <w:shd w:fill="F8FAFA"/>
+            <w:shd w:fill="F5F1EA"/>
             <w:tcMar>
               <w:top w:w="75" w:type="dxa"/>
               <w:left w:w="75" w:type="dxa"/>
@@ -1374,6 +1419,7 @@
             <w:r>
               <w:rPr>
                 <w:b w:val="0"/>
+                <w:color w:val="1C1F22"/>
                 <w:sz w:val="17"/>
               </w:rPr>
               <w:t>5-6</w:t>
@@ -1384,7 +1430,7 @@
           <w:tcPr>
             <w:tcW w:type="dxa" w:w="4538"/>
             <w:vAlign w:val="center"/>
-            <w:shd w:fill="F8FAFA"/>
+            <w:shd w:fill="F5F1EA"/>
             <w:tcMar>
               <w:top w:w="75" w:type="dxa"/>
               <w:left w:w="75" w:type="dxa"/>
@@ -1399,6 +1445,7 @@
             <w:r>
               <w:rPr>
                 <w:b w:val="0"/>
+                <w:color w:val="1C1F22"/>
                 <w:sz w:val="17"/>
               </w:rPr>
               <w:t>Engineer: booking, atomic holds, hosted checkout adapter, passport and operator controls.</w:t>
@@ -1409,7 +1456,7 @@
           <w:tcPr>
             <w:tcW w:type="dxa" w:w="4340"/>
             <w:vAlign w:val="center"/>
-            <w:shd w:fill="F8FAFA"/>
+            <w:shd w:fill="F5F1EA"/>
             <w:tcMar>
               <w:top w:w="75" w:type="dxa"/>
               <w:left w:w="75" w:type="dxa"/>
@@ -1424,6 +1471,7 @@
             <w:r>
               <w:rPr>
                 <w:b w:val="0"/>
+                <w:color w:val="1C1F22"/>
                 <w:sz w:val="17"/>
               </w:rPr>
               <w:t>Approved provider test access; duplicate/failed/pending events cannot overbook or falsely confirm.</w:t>
@@ -1439,7 +1487,7 @@
           <w:tcPr>
             <w:tcW w:type="dxa" w:w="986"/>
             <w:vAlign w:val="center"/>
-            <w:shd w:fill="FFFFFF"/>
+            <w:shd w:fill="FDFBF7"/>
             <w:tcMar>
               <w:top w:w="75" w:type="dxa"/>
               <w:left w:w="75" w:type="dxa"/>
@@ -1454,6 +1502,7 @@
             <w:r>
               <w:rPr>
                 <w:b w:val="0"/>
+                <w:color w:val="1C1F22"/>
                 <w:sz w:val="17"/>
               </w:rPr>
               <w:t>7-8</w:t>
@@ -1464,7 +1513,7 @@
           <w:tcPr>
             <w:tcW w:type="dxa" w:w="4538"/>
             <w:vAlign w:val="center"/>
-            <w:shd w:fill="FFFFFF"/>
+            <w:shd w:fill="FDFBF7"/>
             <w:tcMar>
               <w:top w:w="75" w:type="dxa"/>
               <w:left w:w="75" w:type="dxa"/>
@@ -1479,6 +1528,7 @@
             <w:r>
               <w:rPr>
                 <w:b w:val="0"/>
+                <w:color w:val="1C1F22"/>
                 <w:sz w:val="17"/>
               </w:rPr>
               <w:t>QA/security + operator: refund/reconciliation tests, role access, privacy controls and content audit.</w:t>
@@ -1489,7 +1539,7 @@
           <w:tcPr>
             <w:tcW w:type="dxa" w:w="4340"/>
             <w:vAlign w:val="center"/>
-            <w:shd w:fill="FFFFFF"/>
+            <w:shd w:fill="FDFBF7"/>
             <w:tcMar>
               <w:top w:w="75" w:type="dxa"/>
               <w:left w:w="75" w:type="dxa"/>
@@ -1504,6 +1554,7 @@
             <w:r>
               <w:rPr>
                 <w:b w:val="0"/>
+                <w:color w:val="1C1F22"/>
                 <w:sz w:val="17"/>
               </w:rPr>
               <w:t>Merchant terms agreed; no unresolved critical security/payment defect; guides/transport verified.</w:t>
@@ -1519,7 +1570,7 @@
           <w:tcPr>
             <w:tcW w:type="dxa" w:w="986"/>
             <w:vAlign w:val="center"/>
-            <w:shd w:fill="F8FAFA"/>
+            <w:shd w:fill="F5F1EA"/>
             <w:tcMar>
               <w:top w:w="75" w:type="dxa"/>
               <w:left w:w="75" w:type="dxa"/>
@@ -1534,6 +1585,7 @@
             <w:r>
               <w:rPr>
                 <w:b w:val="0"/>
+                <w:color w:val="1C1F22"/>
                 <w:sz w:val="17"/>
               </w:rPr>
               <w:t>9-10</w:t>
@@ -1544,7 +1596,7 @@
           <w:tcPr>
             <w:tcW w:type="dxa" w:w="4538"/>
             <w:vAlign w:val="center"/>
-            <w:shd w:fill="F8FAFA"/>
+            <w:shd w:fill="F5F1EA"/>
             <w:tcMar>
               <w:top w:w="75" w:type="dxa"/>
               <w:left w:w="75" w:type="dxa"/>
@@ -1559,6 +1611,7 @@
             <w:r>
               <w:rPr>
                 <w:b w:val="0"/>
+                <w:color w:val="1C1F22"/>
                 <w:sz w:val="17"/>
               </w:rPr>
               <w:t>UX + operator: recruit ten target adults, run consented tasks, train staff and revise.</w:t>
@@ -1569,7 +1622,7 @@
           <w:tcPr>
             <w:tcW w:type="dxa" w:w="4340"/>
             <w:vAlign w:val="center"/>
-            <w:shd w:fill="F8FAFA"/>
+            <w:shd w:fill="F5F1EA"/>
             <w:tcMar>
               <w:top w:w="75" w:type="dxa"/>
               <w:left w:w="75" w:type="dxa"/>
@@ -1584,6 +1637,7 @@
             <w:r>
               <w:rPr>
                 <w:b w:val="0"/>
+                <w:color w:val="1C1F22"/>
                 <w:sz w:val="17"/>
               </w:rPr>
               <w:t>Consent and synthetic test data; actual observations recorded, failures prioritized.</w:t>
@@ -1599,7 +1653,7 @@
           <w:tcPr>
             <w:tcW w:type="dxa" w:w="986"/>
             <w:vAlign w:val="center"/>
-            <w:shd w:fill="FFFFFF"/>
+            <w:shd w:fill="FDFBF7"/>
             <w:tcMar>
               <w:top w:w="75" w:type="dxa"/>
               <w:left w:w="75" w:type="dxa"/>
@@ -1614,6 +1668,7 @@
             <w:r>
               <w:rPr>
                 <w:b w:val="0"/>
+                <w:color w:val="1C1F22"/>
                 <w:sz w:val="17"/>
               </w:rPr>
               <w:t>11-12</w:t>
@@ -1624,7 +1679,7 @@
           <w:tcPr>
             <w:tcW w:type="dxa" w:w="4538"/>
             <w:vAlign w:val="center"/>
-            <w:shd w:fill="FFFFFF"/>
+            <w:shd w:fill="FDFBF7"/>
             <w:tcMar>
               <w:top w:w="75" w:type="dxa"/>
               <w:left w:w="75" w:type="dxa"/>
@@ -1639,6 +1694,7 @@
             <w:r>
               <w:rPr>
                 <w:b w:val="0"/>
+                <w:color w:val="1C1F22"/>
                 <w:sz w:val="17"/>
               </w:rPr>
               <w:t>Engineer + operator: retest fixes, rehearse operations, approve capped live pilot.</w:t>
@@ -1649,7 +1705,7 @@
           <w:tcPr>
             <w:tcW w:type="dxa" w:w="4340"/>
             <w:vAlign w:val="center"/>
-            <w:shd w:fill="FFFFFF"/>
+            <w:shd w:fill="FDFBF7"/>
             <w:tcMar>
               <w:top w:w="75" w:type="dxa"/>
               <w:left w:w="75" w:type="dxa"/>
@@ -1664,6 +1720,7 @@
             <w:r>
               <w:rPr>
                 <w:b w:val="0"/>
+                <w:color w:val="1C1F22"/>
                 <w:sz w:val="17"/>
               </w:rPr>
               <w:t>Critical gates passed, support/refund owner ready, approved capacity and rollback plan.</w:t>
@@ -1706,7 +1763,7 @@
         <w:widowControl/>
       </w:pPr>
       <w:r>
-        <w:t>Agent-driven browser checks covered desktop 1440, mobile 360 and tablet 768 layouts, with no horizontal checkout overflow. A two-person Charyn booking retained its 116,000 KZT total across checkout/passport; decline, pending, cancellation, success, reload persistence, guide assignment and no-match recovery were exercised. A three-person Burabay match preserved dates and the 144,000 KZT total, with a confirmed mobile demo booking also observed. Keyboard focus was visible and the console had no errors/warnings. Twenty automated tests passed: 14 HTTP, five UI regression and one font-serving test. These are software checks, not real-user evidence; see docs/verification.md.</w:t>
+        <w:t>Agent-driven Chrome checks exercised 1440, 768 and 360px layouts, mood filters, new-tour authoring/matching, private question and answer persistence, guide assignment and booking recovery. A three-person Charyn booking retained its accepted 174,000 KZT total after the catalog price and cancellation policy changed. Checkout drafts survived navigation/reload and required renewed consent. Declined, pending and confirmed states were visibly distinct. Keyboard focus was visible and the final warning/error log was empty. All 42 automated tests passed. Review and regression checks fixed stale checkout responses, multiline input, departure limits and the live party total on the Truth Card. These are software checks, not user research; see docs/full-demo-verification.md and docs/samal-verification.md.</w:t>
       </w:r>
     </w:p>
     <w:p>
@@ -1760,7 +1817,7 @@
           <w:tcPr>
             <w:tcW w:type="dxa" w:w="4735"/>
             <w:vAlign w:val="center"/>
-            <w:shd w:fill="E5EDF0"/>
+            <w:shd w:fill="304D43"/>
             <w:tcMar>
               <w:top w:w="75" w:type="dxa"/>
               <w:left w:w="75" w:type="dxa"/>
@@ -1775,6 +1832,7 @@
             <w:r>
               <w:rPr>
                 <w:b/>
+                <w:color w:val="FFFFFF"/>
                 <w:sz w:val="17"/>
               </w:rPr>
               <w:t>Initial work</w:t>
@@ -1785,7 +1843,7 @@
           <w:tcPr>
             <w:tcW w:type="dxa" w:w="1184"/>
             <w:vAlign w:val="center"/>
-            <w:shd w:fill="E5EDF0"/>
+            <w:shd w:fill="304D43"/>
             <w:tcMar>
               <w:top w:w="75" w:type="dxa"/>
               <w:left w:w="75" w:type="dxa"/>
@@ -1800,6 +1858,7 @@
             <w:r>
               <w:rPr>
                 <w:b/>
+                <w:color w:val="FFFFFF"/>
                 <w:sz w:val="17"/>
               </w:rPr>
               <w:t>Hours</w:t>
@@ -1810,7 +1869,7 @@
           <w:tcPr>
             <w:tcW w:type="dxa" w:w="1776"/>
             <w:vAlign w:val="center"/>
-            <w:shd w:fill="E5EDF0"/>
+            <w:shd w:fill="304D43"/>
             <w:tcMar>
               <w:top w:w="75" w:type="dxa"/>
               <w:left w:w="75" w:type="dxa"/>
@@ -1825,6 +1884,7 @@
             <w:r>
               <w:rPr>
                 <w:b/>
+                <w:color w:val="FFFFFF"/>
                 <w:sz w:val="17"/>
               </w:rPr>
               <w:t>KZT/hour</w:t>
@@ -1835,7 +1895,7 @@
           <w:tcPr>
             <w:tcW w:type="dxa" w:w="2170"/>
             <w:vAlign w:val="center"/>
-            <w:shd w:fill="E5EDF0"/>
+            <w:shd w:fill="304D43"/>
             <w:tcMar>
               <w:top w:w="75" w:type="dxa"/>
               <w:left w:w="75" w:type="dxa"/>
@@ -1850,6 +1910,7 @@
             <w:r>
               <w:rPr>
                 <w:b/>
+                <w:color w:val="FFFFFF"/>
                 <w:sz w:val="17"/>
               </w:rPr>
               <w:t>KZT</w:t>
@@ -1865,7 +1926,7 @@
           <w:tcPr>
             <w:tcW w:type="dxa" w:w="4735"/>
             <w:vAlign w:val="center"/>
-            <w:shd w:fill="F8FAFA"/>
+            <w:shd w:fill="F5F1EA"/>
             <w:tcMar>
               <w:top w:w="75" w:type="dxa"/>
               <w:left w:w="75" w:type="dxa"/>
@@ -1880,6 +1941,7 @@
             <w:r>
               <w:rPr>
                 <w:b w:val="0"/>
+                <w:color w:val="1C1F22"/>
                 <w:sz w:val="17"/>
               </w:rPr>
               <w:t>Research and journey design</w:t>
@@ -1890,7 +1952,7 @@
           <w:tcPr>
             <w:tcW w:type="dxa" w:w="1184"/>
             <w:vAlign w:val="center"/>
-            <w:shd w:fill="F8FAFA"/>
+            <w:shd w:fill="F5F1EA"/>
             <w:tcMar>
               <w:top w:w="75" w:type="dxa"/>
               <w:left w:w="75" w:type="dxa"/>
@@ -1905,6 +1967,7 @@
             <w:r>
               <w:rPr>
                 <w:b w:val="0"/>
+                <w:color w:val="1C1F22"/>
                 <w:sz w:val="17"/>
               </w:rPr>
               <w:t>80</w:t>
@@ -1915,7 +1978,7 @@
           <w:tcPr>
             <w:tcW w:type="dxa" w:w="1776"/>
             <w:vAlign w:val="center"/>
-            <w:shd w:fill="F8FAFA"/>
+            <w:shd w:fill="F5F1EA"/>
             <w:tcMar>
               <w:top w:w="75" w:type="dxa"/>
               <w:left w:w="75" w:type="dxa"/>
@@ -1930,6 +1993,7 @@
             <w:r>
               <w:rPr>
                 <w:b w:val="0"/>
+                <w:color w:val="1C1F22"/>
                 <w:sz w:val="17"/>
               </w:rPr>
               <w:t>7,000</w:t>
@@ -1940,7 +2004,7 @@
           <w:tcPr>
             <w:tcW w:type="dxa" w:w="2170"/>
             <w:vAlign w:val="center"/>
-            <w:shd w:fill="F8FAFA"/>
+            <w:shd w:fill="F5F1EA"/>
             <w:tcMar>
               <w:top w:w="75" w:type="dxa"/>
               <w:left w:w="75" w:type="dxa"/>
@@ -1955,6 +2019,7 @@
             <w:r>
               <w:rPr>
                 <w:b w:val="0"/>
+                <w:color w:val="1C1F22"/>
                 <w:sz w:val="17"/>
               </w:rPr>
               <w:t>560,000</w:t>
@@ -1970,7 +2035,7 @@
           <w:tcPr>
             <w:tcW w:type="dxa" w:w="4735"/>
             <w:vAlign w:val="center"/>
-            <w:shd w:fill="FFFFFF"/>
+            <w:shd w:fill="FDFBF7"/>
             <w:tcMar>
               <w:top w:w="75" w:type="dxa"/>
               <w:left w:w="75" w:type="dxa"/>
@@ -1985,6 +2050,7 @@
             <w:r>
               <w:rPr>
                 <w:b w:val="0"/>
+                <w:color w:val="1C1F22"/>
                 <w:sz w:val="17"/>
               </w:rPr>
               <w:t>Product and interface design</w:t>
@@ -1995,7 +2061,7 @@
           <w:tcPr>
             <w:tcW w:type="dxa" w:w="1184"/>
             <w:vAlign w:val="center"/>
-            <w:shd w:fill="FFFFFF"/>
+            <w:shd w:fill="FDFBF7"/>
             <w:tcMar>
               <w:top w:w="75" w:type="dxa"/>
               <w:left w:w="75" w:type="dxa"/>
@@ -2010,6 +2076,7 @@
             <w:r>
               <w:rPr>
                 <w:b w:val="0"/>
+                <w:color w:val="1C1F22"/>
                 <w:sz w:val="17"/>
               </w:rPr>
               <w:t>100</w:t>
@@ -2020,7 +2087,7 @@
           <w:tcPr>
             <w:tcW w:type="dxa" w:w="1776"/>
             <w:vAlign w:val="center"/>
-            <w:shd w:fill="FFFFFF"/>
+            <w:shd w:fill="FDFBF7"/>
             <w:tcMar>
               <w:top w:w="75" w:type="dxa"/>
               <w:left w:w="75" w:type="dxa"/>
@@ -2035,6 +2102,7 @@
             <w:r>
               <w:rPr>
                 <w:b w:val="0"/>
+                <w:color w:val="1C1F22"/>
                 <w:sz w:val="17"/>
               </w:rPr>
               <w:t>8,000</w:t>
@@ -2045,7 +2113,7 @@
           <w:tcPr>
             <w:tcW w:type="dxa" w:w="2170"/>
             <w:vAlign w:val="center"/>
-            <w:shd w:fill="FFFFFF"/>
+            <w:shd w:fill="FDFBF7"/>
             <w:tcMar>
               <w:top w:w="75" w:type="dxa"/>
               <w:left w:w="75" w:type="dxa"/>
@@ -2060,6 +2128,7 @@
             <w:r>
               <w:rPr>
                 <w:b w:val="0"/>
+                <w:color w:val="1C1F22"/>
                 <w:sz w:val="17"/>
               </w:rPr>
               <w:t>800,000</w:t>
@@ -2075,7 +2144,7 @@
           <w:tcPr>
             <w:tcW w:type="dxa" w:w="4735"/>
             <w:vAlign w:val="center"/>
-            <w:shd w:fill="F8FAFA"/>
+            <w:shd w:fill="F5F1EA"/>
             <w:tcMar>
               <w:top w:w="75" w:type="dxa"/>
               <w:left w:w="75" w:type="dxa"/>
@@ -2090,6 +2159,7 @@
             <w:r>
               <w:rPr>
                 <w:b w:val="0"/>
+                <w:color w:val="1C1F22"/>
                 <w:sz w:val="17"/>
               </w:rPr>
               <w:t>Application engineering</w:t>
@@ -2100,7 +2170,7 @@
           <w:tcPr>
             <w:tcW w:type="dxa" w:w="1184"/>
             <w:vAlign w:val="center"/>
-            <w:shd w:fill="F8FAFA"/>
+            <w:shd w:fill="F5F1EA"/>
             <w:tcMar>
               <w:top w:w="75" w:type="dxa"/>
               <w:left w:w="75" w:type="dxa"/>
@@ -2115,6 +2185,7 @@
             <w:r>
               <w:rPr>
                 <w:b w:val="0"/>
+                <w:color w:val="1C1F22"/>
                 <w:sz w:val="17"/>
               </w:rPr>
               <w:t>480</w:t>
@@ -2125,7 +2196,7 @@
           <w:tcPr>
             <w:tcW w:type="dxa" w:w="1776"/>
             <w:vAlign w:val="center"/>
-            <w:shd w:fill="F8FAFA"/>
+            <w:shd w:fill="F5F1EA"/>
             <w:tcMar>
               <w:top w:w="75" w:type="dxa"/>
               <w:left w:w="75" w:type="dxa"/>
@@ -2140,6 +2211,7 @@
             <w:r>
               <w:rPr>
                 <w:b w:val="0"/>
+                <w:color w:val="1C1F22"/>
                 <w:sz w:val="17"/>
               </w:rPr>
               <w:t>9,000</w:t>
@@ -2150,7 +2222,7 @@
           <w:tcPr>
             <w:tcW w:type="dxa" w:w="2170"/>
             <w:vAlign w:val="center"/>
-            <w:shd w:fill="F8FAFA"/>
+            <w:shd w:fill="F5F1EA"/>
             <w:tcMar>
               <w:top w:w="75" w:type="dxa"/>
               <w:left w:w="75" w:type="dxa"/>
@@ -2165,6 +2237,7 @@
             <w:r>
               <w:rPr>
                 <w:b w:val="0"/>
+                <w:color w:val="1C1F22"/>
                 <w:sz w:val="17"/>
               </w:rPr>
               <w:t>4,320,000</w:t>
@@ -2180,7 +2253,7 @@
           <w:tcPr>
             <w:tcW w:type="dxa" w:w="4735"/>
             <w:vAlign w:val="center"/>
-            <w:shd w:fill="FFFFFF"/>
+            <w:shd w:fill="FDFBF7"/>
             <w:tcMar>
               <w:top w:w="75" w:type="dxa"/>
               <w:left w:w="75" w:type="dxa"/>
@@ -2195,6 +2268,7 @@
             <w:r>
               <w:rPr>
                 <w:b w:val="0"/>
+                <w:color w:val="1C1F22"/>
                 <w:sz w:val="17"/>
               </w:rPr>
               <w:t>QA, accessibility and security review</w:t>
@@ -2205,7 +2279,7 @@
           <w:tcPr>
             <w:tcW w:type="dxa" w:w="1184"/>
             <w:vAlign w:val="center"/>
-            <w:shd w:fill="FFFFFF"/>
+            <w:shd w:fill="FDFBF7"/>
             <w:tcMar>
               <w:top w:w="75" w:type="dxa"/>
               <w:left w:w="75" w:type="dxa"/>
@@ -2220,6 +2294,7 @@
             <w:r>
               <w:rPr>
                 <w:b w:val="0"/>
+                <w:color w:val="1C1F22"/>
                 <w:sz w:val="17"/>
               </w:rPr>
               <w:t>120</w:t>
@@ -2230,7 +2305,7 @@
           <w:tcPr>
             <w:tcW w:type="dxa" w:w="1776"/>
             <w:vAlign w:val="center"/>
-            <w:shd w:fill="FFFFFF"/>
+            <w:shd w:fill="FDFBF7"/>
             <w:tcMar>
               <w:top w:w="75" w:type="dxa"/>
               <w:left w:w="75" w:type="dxa"/>
@@ -2245,6 +2320,7 @@
             <w:r>
               <w:rPr>
                 <w:b w:val="0"/>
+                <w:color w:val="1C1F22"/>
                 <w:sz w:val="17"/>
               </w:rPr>
               <w:t>7,000</w:t>
@@ -2255,7 +2331,7 @@
           <w:tcPr>
             <w:tcW w:type="dxa" w:w="2170"/>
             <w:vAlign w:val="center"/>
-            <w:shd w:fill="FFFFFF"/>
+            <w:shd w:fill="FDFBF7"/>
             <w:tcMar>
               <w:top w:w="75" w:type="dxa"/>
               <w:left w:w="75" w:type="dxa"/>
@@ -2270,6 +2346,7 @@
             <w:r>
               <w:rPr>
                 <w:b w:val="0"/>
+                <w:color w:val="1C1F22"/>
                 <w:sz w:val="17"/>
               </w:rPr>
               <w:t>840,000</w:t>
@@ -2285,7 +2362,7 @@
           <w:tcPr>
             <w:tcW w:type="dxa" w:w="4735"/>
             <w:vAlign w:val="center"/>
-            <w:shd w:fill="F8FAFA"/>
+            <w:shd w:fill="F5F1EA"/>
             <w:tcMar>
               <w:top w:w="75" w:type="dxa"/>
               <w:left w:w="75" w:type="dxa"/>
@@ -2300,6 +2377,7 @@
             <w:r>
               <w:rPr>
                 <w:b w:val="0"/>
+                <w:color w:val="1C1F22"/>
                 <w:sz w:val="17"/>
               </w:rPr>
               <w:t>Approved content and translation</w:t>
@@ -2310,7 +2388,7 @@
           <w:tcPr>
             <w:tcW w:type="dxa" w:w="1184"/>
             <w:vAlign w:val="center"/>
-            <w:shd w:fill="F8FAFA"/>
+            <w:shd w:fill="F5F1EA"/>
             <w:tcMar>
               <w:top w:w="75" w:type="dxa"/>
               <w:left w:w="75" w:type="dxa"/>
@@ -2325,6 +2403,7 @@
             <w:r>
               <w:rPr>
                 <w:b w:val="0"/>
+                <w:color w:val="1C1F22"/>
                 <w:sz w:val="17"/>
               </w:rPr>
               <w:t>80</w:t>
@@ -2335,7 +2414,7 @@
           <w:tcPr>
             <w:tcW w:type="dxa" w:w="1776"/>
             <w:vAlign w:val="center"/>
-            <w:shd w:fill="F8FAFA"/>
+            <w:shd w:fill="F5F1EA"/>
             <w:tcMar>
               <w:top w:w="75" w:type="dxa"/>
               <w:left w:w="75" w:type="dxa"/>
@@ -2350,6 +2429,7 @@
             <w:r>
               <w:rPr>
                 <w:b w:val="0"/>
+                <w:color w:val="1C1F22"/>
                 <w:sz w:val="17"/>
               </w:rPr>
               <w:t>6,000</w:t>
@@ -2360,7 +2440,7 @@
           <w:tcPr>
             <w:tcW w:type="dxa" w:w="2170"/>
             <w:vAlign w:val="center"/>
-            <w:shd w:fill="F8FAFA"/>
+            <w:shd w:fill="F5F1EA"/>
             <w:tcMar>
               <w:top w:w="75" w:type="dxa"/>
               <w:left w:w="75" w:type="dxa"/>
@@ -2375,6 +2455,7 @@
             <w:r>
               <w:rPr>
                 <w:b w:val="0"/>
+                <w:color w:val="1C1F22"/>
                 <w:sz w:val="17"/>
               </w:rPr>
               <w:t>480,000</w:t>
@@ -2390,7 +2471,7 @@
           <w:tcPr>
             <w:tcW w:type="dxa" w:w="4735"/>
             <w:vAlign w:val="center"/>
-            <w:shd w:fill="FFFFFF"/>
+            <w:shd w:fill="FDFBF7"/>
             <w:tcMar>
               <w:top w:w="75" w:type="dxa"/>
               <w:left w:w="75" w:type="dxa"/>
@@ -2405,6 +2486,7 @@
             <w:r>
               <w:rPr>
                 <w:b w:val="0"/>
+                <w:color w:val="1C1F22"/>
                 <w:sz w:val="17"/>
               </w:rPr>
               <w:t>Operator training and launch</w:t>
@@ -2415,7 +2497,7 @@
           <w:tcPr>
             <w:tcW w:type="dxa" w:w="1184"/>
             <w:vAlign w:val="center"/>
-            <w:shd w:fill="FFFFFF"/>
+            <w:shd w:fill="FDFBF7"/>
             <w:tcMar>
               <w:top w:w="75" w:type="dxa"/>
               <w:left w:w="75" w:type="dxa"/>
@@ -2430,6 +2512,7 @@
             <w:r>
               <w:rPr>
                 <w:b w:val="0"/>
+                <w:color w:val="1C1F22"/>
                 <w:sz w:val="17"/>
               </w:rPr>
               <w:t>40</w:t>
@@ -2440,7 +2523,7 @@
           <w:tcPr>
             <w:tcW w:type="dxa" w:w="1776"/>
             <w:vAlign w:val="center"/>
-            <w:shd w:fill="FFFFFF"/>
+            <w:shd w:fill="FDFBF7"/>
             <w:tcMar>
               <w:top w:w="75" w:type="dxa"/>
               <w:left w:w="75" w:type="dxa"/>
@@ -2455,6 +2538,7 @@
             <w:r>
               <w:rPr>
                 <w:b w:val="0"/>
+                <w:color w:val="1C1F22"/>
                 <w:sz w:val="17"/>
               </w:rPr>
               <w:t>6,000</w:t>
@@ -2465,7 +2549,7 @@
           <w:tcPr>
             <w:tcW w:type="dxa" w:w="2170"/>
             <w:vAlign w:val="center"/>
-            <w:shd w:fill="FFFFFF"/>
+            <w:shd w:fill="FDFBF7"/>
             <w:tcMar>
               <w:top w:w="75" w:type="dxa"/>
               <w:left w:w="75" w:type="dxa"/>
@@ -2480,6 +2564,7 @@
             <w:r>
               <w:rPr>
                 <w:b w:val="0"/>
+                <w:color w:val="1C1F22"/>
                 <w:sz w:val="17"/>
               </w:rPr>
               <w:t>240,000</w:t>
@@ -2495,7 +2580,7 @@
           <w:tcPr>
             <w:tcW w:type="dxa" w:w="4735"/>
             <w:vAlign w:val="center"/>
-            <w:shd w:fill="F8FAFA"/>
+            <w:shd w:fill="F5F1EA"/>
             <w:tcMar>
               <w:top w:w="75" w:type="dxa"/>
               <w:left w:w="75" w:type="dxa"/>
@@ -2510,6 +2595,7 @@
             <w:r>
               <w:rPr>
                 <w:b w:val="0"/>
+                <w:color w:val="1C1F22"/>
                 <w:sz w:val="17"/>
               </w:rPr>
               <w:t>Production payment integration allowance</w:t>
@@ -2520,7 +2606,7 @@
           <w:tcPr>
             <w:tcW w:type="dxa" w:w="1184"/>
             <w:vAlign w:val="center"/>
-            <w:shd w:fill="F8FAFA"/>
+            <w:shd w:fill="F5F1EA"/>
             <w:tcMar>
               <w:top w:w="75" w:type="dxa"/>
               <w:left w:w="75" w:type="dxa"/>
@@ -2535,6 +2621,7 @@
             <w:r>
               <w:rPr>
                 <w:b w:val="0"/>
+                <w:color w:val="1C1F22"/>
                 <w:sz w:val="17"/>
               </w:rPr>
               <w:t>60</w:t>
@@ -2545,7 +2632,7 @@
           <w:tcPr>
             <w:tcW w:type="dxa" w:w="1776"/>
             <w:vAlign w:val="center"/>
-            <w:shd w:fill="F8FAFA"/>
+            <w:shd w:fill="F5F1EA"/>
             <w:tcMar>
               <w:top w:w="75" w:type="dxa"/>
               <w:left w:w="75" w:type="dxa"/>
@@ -2560,6 +2647,7 @@
             <w:r>
               <w:rPr>
                 <w:b w:val="0"/>
+                <w:color w:val="1C1F22"/>
                 <w:sz w:val="17"/>
               </w:rPr>
               <w:t>9,000</w:t>
@@ -2570,7 +2658,7 @@
           <w:tcPr>
             <w:tcW w:type="dxa" w:w="2170"/>
             <w:vAlign w:val="center"/>
-            <w:shd w:fill="F8FAFA"/>
+            <w:shd w:fill="F5F1EA"/>
             <w:tcMar>
               <w:top w:w="75" w:type="dxa"/>
               <w:left w:w="75" w:type="dxa"/>
@@ -2585,6 +2673,7 @@
             <w:r>
               <w:rPr>
                 <w:b w:val="0"/>
+                <w:color w:val="1C1F22"/>
                 <w:sz w:val="17"/>
               </w:rPr>
               <w:t>540,000</w:t>
@@ -2600,7 +2689,7 @@
           <w:tcPr>
             <w:tcW w:type="dxa" w:w="4735"/>
             <w:vAlign w:val="center"/>
-            <w:shd w:fill="FFFFFF"/>
+            <w:shd w:fill="FDFBF7"/>
             <w:tcMar>
               <w:top w:w="75" w:type="dxa"/>
               <w:left w:w="75" w:type="dxa"/>
@@ -2615,6 +2704,7 @@
             <w:r>
               <w:rPr>
                 <w:b w:val="0"/>
+                <w:color w:val="1C1F22"/>
                 <w:sz w:val="17"/>
               </w:rPr>
               <w:t>Initial work total</w:t>
@@ -2625,7 +2715,7 @@
           <w:tcPr>
             <w:tcW w:type="dxa" w:w="1184"/>
             <w:vAlign w:val="center"/>
-            <w:shd w:fill="FFFFFF"/>
+            <w:shd w:fill="FDFBF7"/>
             <w:tcMar>
               <w:top w:w="75" w:type="dxa"/>
               <w:left w:w="75" w:type="dxa"/>
@@ -2640,6 +2730,7 @@
             <w:r>
               <w:rPr>
                 <w:b w:val="0"/>
+                <w:color w:val="1C1F22"/>
                 <w:sz w:val="17"/>
               </w:rPr>
               <w:t>960</w:t>
@@ -2650,7 +2741,7 @@
           <w:tcPr>
             <w:tcW w:type="dxa" w:w="1776"/>
             <w:vAlign w:val="center"/>
-            <w:shd w:fill="FFFFFF"/>
+            <w:shd w:fill="FDFBF7"/>
             <w:tcMar>
               <w:top w:w="75" w:type="dxa"/>
               <w:left w:w="75" w:type="dxa"/>
@@ -2665,6 +2756,7 @@
             <w:r>
               <w:rPr>
                 <w:b w:val="0"/>
+                <w:color w:val="1C1F22"/>
                 <w:sz w:val="17"/>
               </w:rPr>
             </w:r>
@@ -2674,7 +2766,7 @@
           <w:tcPr>
             <w:tcW w:type="dxa" w:w="2170"/>
             <w:vAlign w:val="center"/>
-            <w:shd w:fill="FFFFFF"/>
+            <w:shd w:fill="FDFBF7"/>
             <w:tcMar>
               <w:top w:w="75" w:type="dxa"/>
               <w:left w:w="75" w:type="dxa"/>
@@ -2689,6 +2781,7 @@
             <w:r>
               <w:rPr>
                 <w:b w:val="0"/>
+                <w:color w:val="1C1F22"/>
                 <w:sz w:val="17"/>
               </w:rPr>
               <w:t>7,780,000</w:t>
@@ -2739,7 +2832,7 @@
           <w:tcPr>
             <w:tcW w:type="dxa" w:w="4834"/>
             <w:vAlign w:val="center"/>
-            <w:shd w:fill="E5EDF0"/>
+            <w:shd w:fill="304D43"/>
             <w:tcMar>
               <w:top w:w="75" w:type="dxa"/>
               <w:left w:w="75" w:type="dxa"/>
@@ -2754,6 +2847,7 @@
             <w:r>
               <w:rPr>
                 <w:b/>
+                <w:color w:val="FFFFFF"/>
                 <w:sz w:val="17"/>
               </w:rPr>
               <w:t>24 month model metric</w:t>
@@ -2764,7 +2858,7 @@
           <w:tcPr>
             <w:tcW w:type="dxa" w:w="2466"/>
             <w:vAlign w:val="center"/>
-            <w:shd w:fill="E5EDF0"/>
+            <w:shd w:fill="304D43"/>
             <w:tcMar>
               <w:top w:w="75" w:type="dxa"/>
               <w:left w:w="75" w:type="dxa"/>
@@ -2779,6 +2873,7 @@
             <w:r>
               <w:rPr>
                 <w:b/>
+                <w:color w:val="FFFFFF"/>
                 <w:sz w:val="17"/>
               </w:rPr>
               <w:t>Base</w:t>
@@ -2789,7 +2884,7 @@
           <w:tcPr>
             <w:tcW w:type="dxa" w:w="2565"/>
             <w:vAlign w:val="center"/>
-            <w:shd w:fill="E5EDF0"/>
+            <w:shd w:fill="304D43"/>
             <w:tcMar>
               <w:top w:w="75" w:type="dxa"/>
               <w:left w:w="75" w:type="dxa"/>
@@ -2804,6 +2899,7 @@
             <w:r>
               <w:rPr>
                 <w:b/>
+                <w:color w:val="FFFFFF"/>
                 <w:sz w:val="17"/>
               </w:rPr>
               <w:t>30% fewer travelers</w:t>
@@ -2819,7 +2915,7 @@
           <w:tcPr>
             <w:tcW w:type="dxa" w:w="4834"/>
             <w:vAlign w:val="center"/>
-            <w:shd w:fill="F8FAFA"/>
+            <w:shd w:fill="F5F1EA"/>
             <w:tcMar>
               <w:top w:w="75" w:type="dxa"/>
               <w:left w:w="75" w:type="dxa"/>
@@ -2834,6 +2930,7 @@
             <w:r>
               <w:rPr>
                 <w:b w:val="0"/>
+                <w:color w:val="1C1F22"/>
                 <w:sz w:val="17"/>
               </w:rPr>
               <w:t>Incremental completed travelers</w:t>
@@ -2844,7 +2941,7 @@
           <w:tcPr>
             <w:tcW w:type="dxa" w:w="2466"/>
             <w:vAlign w:val="center"/>
-            <w:shd w:fill="F8FAFA"/>
+            <w:shd w:fill="F5F1EA"/>
             <w:tcMar>
               <w:top w:w="75" w:type="dxa"/>
               <w:left w:w="75" w:type="dxa"/>
@@ -2859,6 +2956,7 @@
             <w:r>
               <w:rPr>
                 <w:b w:val="0"/>
+                <w:color w:val="1C1F22"/>
                 <w:sz w:val="17"/>
               </w:rPr>
               <w:t>1,680</w:t>
@@ -2869,7 +2967,7 @@
           <w:tcPr>
             <w:tcW w:type="dxa" w:w="2565"/>
             <w:vAlign w:val="center"/>
-            <w:shd w:fill="F8FAFA"/>
+            <w:shd w:fill="F5F1EA"/>
             <w:tcMar>
               <w:top w:w="75" w:type="dxa"/>
               <w:left w:w="75" w:type="dxa"/>
@@ -2884,6 +2982,7 @@
             <w:r>
               <w:rPr>
                 <w:b w:val="0"/>
+                <w:color w:val="1C1F22"/>
                 <w:sz w:val="17"/>
               </w:rPr>
               <w:t>1,176</w:t>
@@ -2899,7 +2998,7 @@
           <w:tcPr>
             <w:tcW w:type="dxa" w:w="4834"/>
             <w:vAlign w:val="center"/>
-            <w:shd w:fill="FFFFFF"/>
+            <w:shd w:fill="FDFBF7"/>
             <w:tcMar>
               <w:top w:w="75" w:type="dxa"/>
               <w:left w:w="75" w:type="dxa"/>
@@ -2914,6 +3013,7 @@
             <w:r>
               <w:rPr>
                 <w:b w:val="0"/>
+                <w:color w:val="1C1F22"/>
                 <w:sz w:val="17"/>
               </w:rPr>
               <w:t>Incremental tour revenue</w:t>
@@ -2924,7 +3024,7 @@
           <w:tcPr>
             <w:tcW w:type="dxa" w:w="2466"/>
             <w:vAlign w:val="center"/>
-            <w:shd w:fill="FFFFFF"/>
+            <w:shd w:fill="FDFBF7"/>
             <w:tcMar>
               <w:top w:w="75" w:type="dxa"/>
               <w:left w:w="75" w:type="dxa"/>
@@ -2939,6 +3039,7 @@
             <w:r>
               <w:rPr>
                 <w:b w:val="0"/>
+                <w:color w:val="1C1F22"/>
                 <w:sz w:val="17"/>
               </w:rPr>
               <w:t>73,920,000</w:t>
@@ -2949,7 +3050,7 @@
           <w:tcPr>
             <w:tcW w:type="dxa" w:w="2565"/>
             <w:vAlign w:val="center"/>
-            <w:shd w:fill="FFFFFF"/>
+            <w:shd w:fill="FDFBF7"/>
             <w:tcMar>
               <w:top w:w="75" w:type="dxa"/>
               <w:left w:w="75" w:type="dxa"/>
@@ -2964,6 +3065,7 @@
             <w:r>
               <w:rPr>
                 <w:b w:val="0"/>
+                <w:color w:val="1C1F22"/>
                 <w:sz w:val="17"/>
               </w:rPr>
               <w:t>51,744,000</w:t>
@@ -2979,7 +3081,7 @@
           <w:tcPr>
             <w:tcW w:type="dxa" w:w="4834"/>
             <w:vAlign w:val="center"/>
-            <w:shd w:fill="F8FAFA"/>
+            <w:shd w:fill="F5F1EA"/>
             <w:tcMar>
               <w:top w:w="75" w:type="dxa"/>
               <w:left w:w="75" w:type="dxa"/>
@@ -2994,6 +3096,7 @@
             <w:r>
               <w:rPr>
                 <w:b w:val="0"/>
+                <w:color w:val="1C1F22"/>
                 <w:sz w:val="17"/>
               </w:rPr>
               <w:t>Incremental contribution</w:t>
@@ -3004,7 +3107,7 @@
           <w:tcPr>
             <w:tcW w:type="dxa" w:w="2466"/>
             <w:vAlign w:val="center"/>
-            <w:shd w:fill="F8FAFA"/>
+            <w:shd w:fill="F5F1EA"/>
             <w:tcMar>
               <w:top w:w="75" w:type="dxa"/>
               <w:left w:w="75" w:type="dxa"/>
@@ -3019,6 +3122,7 @@
             <w:r>
               <w:rPr>
                 <w:b w:val="0"/>
+                <w:color w:val="1C1F22"/>
                 <w:sz w:val="17"/>
               </w:rPr>
               <w:t>19,219,200</w:t>
@@ -3029,7 +3133,7 @@
           <w:tcPr>
             <w:tcW w:type="dxa" w:w="2565"/>
             <w:vAlign w:val="center"/>
-            <w:shd w:fill="F8FAFA"/>
+            <w:shd w:fill="F5F1EA"/>
             <w:tcMar>
               <w:top w:w="75" w:type="dxa"/>
               <w:left w:w="75" w:type="dxa"/>
@@ -3044,6 +3148,7 @@
             <w:r>
               <w:rPr>
                 <w:b w:val="0"/>
+                <w:color w:val="1C1F22"/>
                 <w:sz w:val="17"/>
               </w:rPr>
               <w:t>13,453,440</w:t>
@@ -3059,7 +3164,7 @@
           <w:tcPr>
             <w:tcW w:type="dxa" w:w="4834"/>
             <w:vAlign w:val="center"/>
-            <w:shd w:fill="FFFFFF"/>
+            <w:shd w:fill="FDFBF7"/>
             <w:tcMar>
               <w:top w:w="75" w:type="dxa"/>
               <w:left w:w="75" w:type="dxa"/>
@@ -3074,6 +3179,7 @@
             <w:r>
               <w:rPr>
                 <w:b w:val="0"/>
+                <w:color w:val="1C1F22"/>
                 <w:sz w:val="17"/>
               </w:rPr>
               <w:t>Cumulative project cash flow</w:t>
@@ -3084,7 +3190,7 @@
           <w:tcPr>
             <w:tcW w:type="dxa" w:w="2466"/>
             <w:vAlign w:val="center"/>
-            <w:shd w:fill="FFFFFF"/>
+            <w:shd w:fill="FDFBF7"/>
             <w:tcMar>
               <w:top w:w="75" w:type="dxa"/>
               <w:left w:w="75" w:type="dxa"/>
@@ -3099,6 +3205,7 @@
             <w:r>
               <w:rPr>
                 <w:b w:val="0"/>
+                <w:color w:val="1C1F22"/>
                 <w:sz w:val="17"/>
               </w:rPr>
               <w:t>261,200</w:t>
@@ -3109,7 +3216,7 @@
           <w:tcPr>
             <w:tcW w:type="dxa" w:w="2565"/>
             <w:vAlign w:val="center"/>
-            <w:shd w:fill="FFFFFF"/>
+            <w:shd w:fill="FDFBF7"/>
             <w:tcMar>
               <w:top w:w="75" w:type="dxa"/>
               <w:left w:w="75" w:type="dxa"/>
@@ -3124,6 +3231,7 @@
             <w:r>
               <w:rPr>
                 <w:b w:val="0"/>
+                <w:color w:val="1C1F22"/>
                 <w:sz w:val="17"/>
               </w:rPr>
               <w:t>-5,504,560</w:t>
@@ -3139,7 +3247,7 @@
           <w:tcPr>
             <w:tcW w:type="dxa" w:w="4834"/>
             <w:vAlign w:val="center"/>
-            <w:shd w:fill="F8FAFA"/>
+            <w:shd w:fill="F5F1EA"/>
             <w:tcMar>
               <w:top w:w="75" w:type="dxa"/>
               <w:left w:w="75" w:type="dxa"/>
@@ -3154,6 +3262,7 @@
             <w:r>
               <w:rPr>
                 <w:b w:val="0"/>
+                <w:color w:val="1C1F22"/>
                 <w:sz w:val="17"/>
               </w:rPr>
               <w:t>Peak funding required</w:t>
@@ -3164,7 +3273,7 @@
           <w:tcPr>
             <w:tcW w:type="dxa" w:w="2466"/>
             <w:vAlign w:val="center"/>
-            <w:shd w:fill="F8FAFA"/>
+            <w:shd w:fill="F5F1EA"/>
             <w:tcMar>
               <w:top w:w="75" w:type="dxa"/>
               <w:left w:w="75" w:type="dxa"/>
@@ -3179,6 +3288,7 @@
             <w:r>
               <w:rPr>
                 <w:b w:val="0"/>
+                <w:color w:val="1C1F22"/>
                 <w:sz w:val="17"/>
               </w:rPr>
               <w:t>11,378,800</w:t>
@@ -3189,7 +3299,7 @@
           <w:tcPr>
             <w:tcW w:type="dxa" w:w="2565"/>
             <w:vAlign w:val="center"/>
-            <w:shd w:fill="F8FAFA"/>
+            <w:shd w:fill="F5F1EA"/>
             <w:tcMar>
               <w:top w:w="75" w:type="dxa"/>
               <w:left w:w="75" w:type="dxa"/>
@@ -3204,6 +3314,7 @@
             <w:r>
               <w:rPr>
                 <w:b w:val="0"/>
+                <w:color w:val="1C1F22"/>
                 <w:sz w:val="17"/>
               </w:rPr>
               <w:t>12,147,792</w:t>
@@ -3219,7 +3330,7 @@
           <w:tcPr>
             <w:tcW w:type="dxa" w:w="4834"/>
             <w:vAlign w:val="center"/>
-            <w:shd w:fill="FFFFFF"/>
+            <w:shd w:fill="FDFBF7"/>
             <w:tcMar>
               <w:top w:w="75" w:type="dxa"/>
               <w:left w:w="75" w:type="dxa"/>
@@ -3234,6 +3345,7 @@
             <w:r>
               <w:rPr>
                 <w:b w:val="0"/>
+                <w:color w:val="1C1F22"/>
                 <w:sz w:val="17"/>
               </w:rPr>
               <w:t>First nonnegative cumulative month</w:t>
@@ -3244,7 +3356,7 @@
           <w:tcPr>
             <w:tcW w:type="dxa" w:w="2466"/>
             <w:vAlign w:val="center"/>
-            <w:shd w:fill="FFFFFF"/>
+            <w:shd w:fill="FDFBF7"/>
             <w:tcMar>
               <w:top w:w="75" w:type="dxa"/>
               <w:left w:w="75" w:type="dxa"/>
@@ -3259,6 +3371,7 @@
             <w:r>
               <w:rPr>
                 <w:b w:val="0"/>
+                <w:color w:val="1C1F22"/>
                 <w:sz w:val="17"/>
               </w:rPr>
               <w:t>Month 23</w:t>
@@ -3269,7 +3382,7 @@
           <w:tcPr>
             <w:tcW w:type="dxa" w:w="2565"/>
             <w:vAlign w:val="center"/>
-            <w:shd w:fill="FFFFFF"/>
+            <w:shd w:fill="FDFBF7"/>
             <w:tcMar>
               <w:top w:w="75" w:type="dxa"/>
               <w:left w:w="75" w:type="dxa"/>
@@ -3284,6 +3397,7 @@
             <w:r>
               <w:rPr>
                 <w:b w:val="0"/>
+                <w:color w:val="1C1F22"/>
                 <w:sz w:val="17"/>
               </w:rPr>
               <w:t>Not reached in 24 months</w:t>
@@ -3299,7 +3413,7 @@
           <w:tcPr>
             <w:tcW w:type="dxa" w:w="4834"/>
             <w:vAlign w:val="center"/>
-            <w:shd w:fill="F8FAFA"/>
+            <w:shd w:fill="F5F1EA"/>
             <w:tcMar>
               <w:top w:w="75" w:type="dxa"/>
               <w:left w:w="75" w:type="dxa"/>
@@ -3314,6 +3428,7 @@
             <w:r>
               <w:rPr>
                 <w:b w:val="0"/>
+                <w:color w:val="1C1F22"/>
                 <w:sz w:val="17"/>
               </w:rPr>
               <w:t>Year 1 gross cash uses</w:t>
@@ -3324,7 +3439,7 @@
           <w:tcPr>
             <w:tcW w:type="dxa" w:w="2466"/>
             <w:vAlign w:val="center"/>
-            <w:shd w:fill="F8FAFA"/>
+            <w:shd w:fill="F5F1EA"/>
             <w:tcMar>
               <w:top w:w="75" w:type="dxa"/>
               <w:left w:w="75" w:type="dxa"/>
@@ -3339,6 +3454,7 @@
             <w:r>
               <w:rPr>
                 <w:b w:val="0"/>
+                <w:color w:val="1C1F22"/>
                 <w:sz w:val="17"/>
               </w:rPr>
               <w:t>19,298,800</w:t>
@@ -3349,7 +3465,7 @@
           <w:tcPr>
             <w:tcW w:type="dxa" w:w="2565"/>
             <w:vAlign w:val="center"/>
-            <w:shd w:fill="F8FAFA"/>
+            <w:shd w:fill="F5F1EA"/>
             <w:tcMar>
               <w:top w:w="75" w:type="dxa"/>
               <w:left w:w="75" w:type="dxa"/>
@@ -3364,6 +3480,7 @@
             <w:r>
               <w:rPr>
                 <w:b w:val="0"/>
+                <w:color w:val="1C1F22"/>
                 <w:sz w:val="17"/>
               </w:rPr>
               <w:t>17,540,560</w:t>
@@ -3459,7 +3576,7 @@
           <w:tcPr>
             <w:tcW w:type="dxa" w:w="2565"/>
             <w:vAlign w:val="center"/>
-            <w:shd w:fill="E5EDF0"/>
+            <w:shd w:fill="304D43"/>
             <w:tcMar>
               <w:top w:w="75" w:type="dxa"/>
               <w:left w:w="75" w:type="dxa"/>
@@ -3474,6 +3591,7 @@
             <w:r>
               <w:rPr>
                 <w:b/>
+                <w:color w:val="FFFFFF"/>
                 <w:sz w:val="17"/>
               </w:rPr>
               <w:t>Risk and owner</w:t>
@@ -3484,7 +3602,7 @@
           <w:tcPr>
             <w:tcW w:type="dxa" w:w="4242"/>
             <w:vAlign w:val="center"/>
-            <w:shd w:fill="E5EDF0"/>
+            <w:shd w:fill="304D43"/>
             <w:tcMar>
               <w:top w:w="75" w:type="dxa"/>
               <w:left w:w="75" w:type="dxa"/>
@@ -3499,6 +3617,7 @@
             <w:r>
               <w:rPr>
                 <w:b/>
+                <w:color w:val="FFFFFF"/>
                 <w:sz w:val="17"/>
               </w:rPr>
               <w:t>Mitigation</w:t>
@@ -3509,7 +3628,7 @@
           <w:tcPr>
             <w:tcW w:type="dxa" w:w="3058"/>
             <w:vAlign w:val="center"/>
-            <w:shd w:fill="E5EDF0"/>
+            <w:shd w:fill="304D43"/>
             <w:tcMar>
               <w:top w:w="75" w:type="dxa"/>
               <w:left w:w="75" w:type="dxa"/>
@@ -3524,6 +3643,7 @@
             <w:r>
               <w:rPr>
                 <w:b/>
+                <w:color w:val="FFFFFF"/>
                 <w:sz w:val="17"/>
               </w:rPr>
               <w:t>Warning or stop trigger</w:t>
@@ -3539,7 +3659,7 @@
           <w:tcPr>
             <w:tcW w:type="dxa" w:w="2565"/>
             <w:vAlign w:val="center"/>
-            <w:shd w:fill="F8FAFA"/>
+            <w:shd w:fill="F5F1EA"/>
             <w:tcMar>
               <w:top w:w="75" w:type="dxa"/>
               <w:left w:w="75" w:type="dxa"/>
@@ -3554,6 +3674,7 @@
             <w:r>
               <w:rPr>
                 <w:b w:val="0"/>
+                <w:color w:val="1C1F22"/>
                 <w:sz w:val="17"/>
               </w:rPr>
               <w:t>Misinformation / product owner</w:t>
@@ -3564,7 +3685,7 @@
           <w:tcPr>
             <w:tcW w:type="dxa" w:w="4242"/>
             <w:vAlign w:val="center"/>
-            <w:shd w:fill="F8FAFA"/>
+            <w:shd w:fill="F5F1EA"/>
             <w:tcMar>
               <w:top w:w="75" w:type="dxa"/>
               <w:left w:w="75" w:type="dxa"/>
@@ -3579,6 +3700,7 @@
             <w:r>
               <w:rPr>
                 <w:b w:val="0"/>
+                <w:color w:val="1C1F22"/>
                 <w:sz w:val="17"/>
               </w:rPr>
               <w:t>Approved card data; deterministic dates, price and seats; human follow-up.</w:t>
@@ -3589,7 +3711,7 @@
           <w:tcPr>
             <w:tcW w:type="dxa" w:w="3058"/>
             <w:vAlign w:val="center"/>
-            <w:shd w:fill="F8FAFA"/>
+            <w:shd w:fill="F5F1EA"/>
             <w:tcMar>
               <w:top w:w="75" w:type="dxa"/>
               <w:left w:w="75" w:type="dxa"/>
@@ -3604,6 +3726,7 @@
             <w:r>
               <w:rPr>
                 <w:b w:val="0"/>
+                <w:color w:val="1C1F22"/>
                 <w:sz w:val="17"/>
               </w:rPr>
               <w:t>Any unsupported promise or price contradiction.</w:t>
@@ -3619,7 +3742,7 @@
           <w:tcPr>
             <w:tcW w:type="dxa" w:w="2565"/>
             <w:vAlign w:val="center"/>
-            <w:shd w:fill="FFFFFF"/>
+            <w:shd w:fill="FDFBF7"/>
             <w:tcMar>
               <w:top w:w="75" w:type="dxa"/>
               <w:left w:w="75" w:type="dxa"/>
@@ -3634,6 +3757,7 @@
             <w:r>
               <w:rPr>
                 <w:b w:val="0"/>
+                <w:color w:val="1C1F22"/>
                 <w:sz w:val="17"/>
               </w:rPr>
               <w:t>Payments / finance + engineer</w:t>
@@ -3644,7 +3768,7 @@
           <w:tcPr>
             <w:tcW w:type="dxa" w:w="4242"/>
             <w:vAlign w:val="center"/>
-            <w:shd w:fill="FFFFFF"/>
+            <w:shd w:fill="FDFBF7"/>
             <w:tcMar>
               <w:top w:w="75" w:type="dxa"/>
               <w:left w:w="75" w:type="dxa"/>
@@ -3659,6 +3783,7 @@
             <w:r>
               <w:rPr>
                 <w:b w:val="0"/>
+                <w:color w:val="1C1F22"/>
                 <w:sz w:val="17"/>
               </w:rPr>
               <w:t>Merchant approval; issuer tests; verified events, refunds and reconciliation.</w:t>
@@ -3669,7 +3794,7 @@
           <w:tcPr>
             <w:tcW w:type="dxa" w:w="3058"/>
             <w:vAlign w:val="center"/>
-            <w:shd w:fill="FFFFFF"/>
+            <w:shd w:fill="FDFBF7"/>
             <w:tcMar>
               <w:top w:w="75" w:type="dxa"/>
               <w:left w:w="75" w:type="dxa"/>
@@ -3684,6 +3809,7 @@
             <w:r>
               <w:rPr>
                 <w:b w:val="0"/>
+                <w:color w:val="1C1F22"/>
                 <w:sz w:val="17"/>
               </w:rPr>
               <w:t>Unknown settlement terms, false confirmation or duplicate charge.</w:t>
@@ -3699,7 +3825,7 @@
           <w:tcPr>
             <w:tcW w:type="dxa" w:w="2565"/>
             <w:vAlign w:val="center"/>
-            <w:shd w:fill="F8FAFA"/>
+            <w:shd w:fill="F5F1EA"/>
             <w:tcMar>
               <w:top w:w="75" w:type="dxa"/>
               <w:left w:w="75" w:type="dxa"/>
@@ -3714,6 +3840,7 @@
             <w:r>
               <w:rPr>
                 <w:b w:val="0"/>
+                <w:color w:val="1C1F22"/>
                 <w:sz w:val="17"/>
               </w:rPr>
               <w:t>Privacy and security / engineer</w:t>
@@ -3724,7 +3851,7 @@
           <w:tcPr>
             <w:tcW w:type="dxa" w:w="4242"/>
             <w:vAlign w:val="center"/>
-            <w:shd w:fill="F8FAFA"/>
+            <w:shd w:fill="F5F1EA"/>
             <w:tcMar>
               <w:top w:w="75" w:type="dxa"/>
               <w:left w:w="75" w:type="dxa"/>
@@ -3739,6 +3866,7 @@
             <w:r>
               <w:rPr>
                 <w:b w:val="0"/>
+                <w:color w:val="1C1F22"/>
                 <w:sz w:val="17"/>
               </w:rPr>
               <w:t>Minimize data; secure roles, logs and retention; external review.</w:t>
@@ -3749,7 +3877,7 @@
           <w:tcPr>
             <w:tcW w:type="dxa" w:w="3058"/>
             <w:vAlign w:val="center"/>
-            <w:shd w:fill="F8FAFA"/>
+            <w:shd w:fill="F5F1EA"/>
             <w:tcMar>
               <w:top w:w="75" w:type="dxa"/>
               <w:left w:w="75" w:type="dxa"/>
@@ -3764,6 +3892,7 @@
             <w:r>
               <w:rPr>
                 <w:b w:val="0"/>
+                <w:color w:val="1C1F22"/>
                 <w:sz w:val="17"/>
               </w:rPr>
               <w:t>Sensitive data leak or unresolved critical access flaw.</w:t>
@@ -3779,7 +3908,7 @@
           <w:tcPr>
             <w:tcW w:type="dxa" w:w="2565"/>
             <w:vAlign w:val="center"/>
-            <w:shd w:fill="FFFFFF"/>
+            <w:shd w:fill="FDFBF7"/>
             <w:tcMar>
               <w:top w:w="75" w:type="dxa"/>
               <w:left w:w="75" w:type="dxa"/>
@@ -3794,6 +3923,7 @@
             <w:r>
               <w:rPr>
                 <w:b w:val="0"/>
+                <w:color w:val="1C1F22"/>
                 <w:sz w:val="17"/>
               </w:rPr>
               <w:t>Acquisition / growth owner</w:t>
@@ -3804,7 +3934,7 @@
           <w:tcPr>
             <w:tcW w:type="dxa" w:w="4242"/>
             <w:vAlign w:val="center"/>
-            <w:shd w:fill="FFFFFF"/>
+            <w:shd w:fill="FDFBF7"/>
             <w:tcMar>
               <w:top w:w="75" w:type="dxa"/>
               <w:left w:w="75" w:type="dxa"/>
@@ -3819,6 +3949,7 @@
             <w:r>
               <w:rPr>
                 <w:b w:val="0"/>
+                <w:color w:val="1C1F22"/>
                 <w:sz w:val="17"/>
               </w:rPr>
               <w:t>Capped cohorts; measure incremental completion and contribution.</w:t>
@@ -3829,7 +3960,7 @@
           <w:tcPr>
             <w:tcW w:type="dxa" w:w="3058"/>
             <w:vAlign w:val="center"/>
-            <w:shd w:fill="FFFFFF"/>
+            <w:shd w:fill="FDFBF7"/>
             <w:tcMar>
               <w:top w:w="75" w:type="dxa"/>
               <w:left w:w="75" w:type="dxa"/>
@@ -3844,6 +3975,7 @@
             <w:r>
               <w:rPr>
                 <w:b w:val="0"/>
+                <w:color w:val="1C1F22"/>
                 <w:sz w:val="17"/>
               </w:rPr>
               <w:t>Acquisition cost exceeds contribution for two cohorts.</w:t>
@@ -3859,7 +3991,7 @@
           <w:tcPr>
             <w:tcW w:type="dxa" w:w="2565"/>
             <w:vAlign w:val="center"/>
-            <w:shd w:fill="F8FAFA"/>
+            <w:shd w:fill="F5F1EA"/>
             <w:tcMar>
               <w:top w:w="75" w:type="dxa"/>
               <w:left w:w="75" w:type="dxa"/>
@@ -3874,6 +4006,7 @@
             <w:r>
               <w:rPr>
                 <w:b w:val="0"/>
+                <w:color w:val="1C1F22"/>
                 <w:sz w:val="17"/>
               </w:rPr>
               <w:t>Delivery and capacity / operator</w:t>
@@ -3884,7 +4017,7 @@
           <w:tcPr>
             <w:tcW w:type="dxa" w:w="4242"/>
             <w:vAlign w:val="center"/>
-            <w:shd w:fill="F8FAFA"/>
+            <w:shd w:fill="F5F1EA"/>
             <w:tcMar>
               <w:top w:w="75" w:type="dxa"/>
               <w:left w:w="75" w:type="dxa"/>
@@ -3899,6 +4032,7 @@
             <w:r>
               <w:rPr>
                 <w:b w:val="0"/>
+                <w:color w:val="1C1F22"/>
                 <w:sz w:val="17"/>
               </w:rPr>
               <w:t>Reserve guides, transport and suppliers; cap departures.</w:t>
@@ -3909,7 +4043,7 @@
           <w:tcPr>
             <w:tcW w:type="dxa" w:w="3058"/>
             <w:vAlign w:val="center"/>
-            <w:shd w:fill="F8FAFA"/>
+            <w:shd w:fill="F5F1EA"/>
             <w:tcMar>
               <w:top w:w="75" w:type="dxa"/>
               <w:left w:w="75" w:type="dxa"/>
@@ -3924,6 +4058,7 @@
             <w:r>
               <w:rPr>
                 <w:b w:val="0"/>
+                <w:color w:val="1C1F22"/>
                 <w:sz w:val="17"/>
               </w:rPr>
               <w:t>Unstaffed departure or planned guide load above 85%.</w:t>
@@ -4123,7 +4258,7 @@
         <w:widowControl/>
       </w:pPr>
       <w:r>
-        <w:t>Figure 1 is a genuine local application capture. The prototype's Charyn Canyon photograph is by Bgag, photographed 22 September 2023, Wikimedia Commons, CC0 1.0. Attribution and destination check: assets/attribution.md. Figure 2 is an AI-assisted project flow diagram, not external evidence.</w:t>
+        <w:t>Figure 1 is a genuine Samal Journeys local application capture. The prototype's Charyn Canyon photograph is by Bgag, photographed 22 September 2023, Wikimedia Commons, CC0 1.0. Attribution and destination check: assets/attribution.md. Figure 2 is an AI-assisted project flow diagram, not external evidence.</w:t>
       </w:r>
     </w:p>
     <w:p>
@@ -4156,7 +4291,7 @@
         <w:widowControl/>
       </w:pPr>
       <w:r>
-        <w:t>This is an AI-assisted working draft requiring substantive human authorship review. The supplied QazaqPass concept and brief were developed with ChatGPT assistance. Codex materially assisted the evidence search and interpretation, product and technical refinement, application code and tests, financial model, document writing, formatting and verification work. This assistance is substantially more than grammar correction.</w:t>
+        <w:t>This is an AI-assisted working draft requiring substantive human authorship review. The supplied product concept and brief were developed with ChatGPT assistance. The user selected the Samal Journeys name; Codex applied the brand and refreshed the demo and supporting artifacts. Codex materially assisted the evidence search and interpretation, product and technical refinement, application code and tests, financial model, document writing, formatting and verification work. This assistance is substantially more than grammar correction.</w:t>
       </w:r>
     </w:p>
     <w:p>
@@ -4196,7 +4331,7 @@
           <w:tcPr>
             <w:tcW w:type="dxa" w:w="2466"/>
             <w:vAlign w:val="center"/>
-            <w:shd w:fill="E5EDF0"/>
+            <w:shd w:fill="304D43"/>
             <w:tcMar>
               <w:top w:w="75" w:type="dxa"/>
               <w:left w:w="75" w:type="dxa"/>
@@ -4211,6 +4346,7 @@
             <w:r>
               <w:rPr>
                 <w:b/>
+                <w:color w:val="FFFFFF"/>
                 <w:sz w:val="17"/>
               </w:rPr>
               <w:t>Capability</w:t>
@@ -4221,7 +4357,7 @@
           <w:tcPr>
             <w:tcW w:type="dxa" w:w="3847"/>
             <w:vAlign w:val="center"/>
-            <w:shd w:fill="E5EDF0"/>
+            <w:shd w:fill="304D43"/>
             <w:tcMar>
               <w:top w:w="75" w:type="dxa"/>
               <w:left w:w="75" w:type="dxa"/>
@@ -4236,6 +4372,7 @@
             <w:r>
               <w:rPr>
                 <w:b/>
+                <w:color w:val="FFFFFF"/>
                 <w:sz w:val="17"/>
               </w:rPr>
               <w:t>Contribution</w:t>
@@ -4246,7 +4383,7 @@
           <w:tcPr>
             <w:tcW w:type="dxa" w:w="3551"/>
             <w:vAlign w:val="center"/>
-            <w:shd w:fill="E5EDF0"/>
+            <w:shd w:fill="304D43"/>
             <w:tcMar>
               <w:top w:w="75" w:type="dxa"/>
               <w:left w:w="75" w:type="dxa"/>
@@ -4261,6 +4398,7 @@
             <w:r>
               <w:rPr>
                 <w:b/>
+                <w:color w:val="FFFFFF"/>
                 <w:sz w:val="17"/>
               </w:rPr>
               <w:t>Limit</w:t>
@@ -4276,7 +4414,7 @@
           <w:tcPr>
             <w:tcW w:type="dxa" w:w="2466"/>
             <w:vAlign w:val="center"/>
-            <w:shd w:fill="F8FAFA"/>
+            <w:shd w:fill="F5F1EA"/>
             <w:tcMar>
               <w:top w:w="75" w:type="dxa"/>
               <w:left w:w="75" w:type="dxa"/>
@@ -4291,6 +4429,7 @@
             <w:r>
               <w:rPr>
                 <w:b w:val="0"/>
+                <w:color w:val="1C1F22"/>
                 <w:sz w:val="17"/>
               </w:rPr>
               <w:t>Codex and Superpowers skills</w:t>
@@ -4301,7 +4440,7 @@
           <w:tcPr>
             <w:tcW w:type="dxa" w:w="3847"/>
             <w:vAlign w:val="center"/>
-            <w:shd w:fill="F8FAFA"/>
+            <w:shd w:fill="F5F1EA"/>
             <w:tcMar>
               <w:top w:w="75" w:type="dxa"/>
               <w:left w:w="75" w:type="dxa"/>
@@ -4316,9 +4455,10 @@
             <w:r>
               <w:rPr>
                 <w:b w:val="0"/>
+                <w:color w:val="1C1F22"/>
                 <w:sz w:val="17"/>
               </w:rPr>
-              <w:t>Requirements, bounded implementation planning, debugging and verification workflow.</w:t>
+              <w:t>Requirements, implementation planning, parallel AI review, debugging and verification.</w:t>
             </w:r>
           </w:p>
         </w:tc>
@@ -4326,7 +4466,7 @@
           <w:tcPr>
             <w:tcW w:type="dxa" w:w="3551"/>
             <w:vAlign w:val="center"/>
-            <w:shd w:fill="F8FAFA"/>
+            <w:shd w:fill="F5F1EA"/>
             <w:tcMar>
               <w:top w:w="75" w:type="dxa"/>
               <w:left w:w="75" w:type="dxa"/>
@@ -4341,6 +4481,7 @@
             <w:r>
               <w:rPr>
                 <w:b w:val="0"/>
+                <w:color w:val="1C1F22"/>
                 <w:sz w:val="17"/>
               </w:rPr>
               <w:t>Decisions remain proposals until team-owned analysis and revision.</w:t>
@@ -4356,7 +4497,7 @@
           <w:tcPr>
             <w:tcW w:type="dxa" w:w="2466"/>
             <w:vAlign w:val="center"/>
-            <w:shd w:fill="FFFFFF"/>
+            <w:shd w:fill="FDFBF7"/>
             <w:tcMar>
               <w:top w:w="75" w:type="dxa"/>
               <w:left w:w="75" w:type="dxa"/>
@@ -4371,6 +4512,7 @@
             <w:r>
               <w:rPr>
                 <w:b w:val="0"/>
+                <w:color w:val="1C1F22"/>
                 <w:sz w:val="17"/>
               </w:rPr>
               <w:t>Web research tools</w:t>
@@ -4381,7 +4523,7 @@
           <w:tcPr>
             <w:tcW w:type="dxa" w:w="3847"/>
             <w:vAlign w:val="center"/>
-            <w:shd w:fill="FFFFFF"/>
+            <w:shd w:fill="FDFBF7"/>
             <w:tcMar>
               <w:top w:w="75" w:type="dxa"/>
               <w:left w:w="75" w:type="dxa"/>
@@ -4396,6 +4538,7 @@
             <w:r>
               <w:rPr>
                 <w:b w:val="0"/>
+                <w:color w:val="1C1F22"/>
                 <w:sz w:val="17"/>
               </w:rPr>
               <w:t>Opened government, airline, vendor and provider pages and recorded sources.</w:t>
@@ -4406,7 +4549,7 @@
           <w:tcPr>
             <w:tcW w:type="dxa" w:w="3551"/>
             <w:vAlign w:val="center"/>
-            <w:shd w:fill="FFFFFF"/>
+            <w:shd w:fill="FDFBF7"/>
             <w:tcMar>
               <w:top w:w="75" w:type="dxa"/>
               <w:left w:w="75" w:type="dxa"/>
@@ -4421,6 +4564,7 @@
             <w:r>
               <w:rPr>
                 <w:b w:val="0"/>
+                <w:color w:val="1C1F22"/>
                 <w:sz w:val="17"/>
               </w:rPr>
               <w:t>AI source checks do not replace the case requirement that the team verify sources itself.</w:t>
@@ -4436,7 +4580,7 @@
           <w:tcPr>
             <w:tcW w:type="dxa" w:w="2466"/>
             <w:vAlign w:val="center"/>
-            <w:shd w:fill="F8FAFA"/>
+            <w:shd w:fill="F5F1EA"/>
             <w:tcMar>
               <w:top w:w="75" w:type="dxa"/>
               <w:left w:w="75" w:type="dxa"/>
@@ -4451,6 +4595,7 @@
             <w:r>
               <w:rPr>
                 <w:b w:val="0"/>
+                <w:color w:val="1C1F22"/>
                 <w:sz w:val="17"/>
               </w:rPr>
               <w:t>Local engineering and browser tools</w:t>
@@ -4461,7 +4606,7 @@
           <w:tcPr>
             <w:tcW w:type="dxa" w:w="3847"/>
             <w:vAlign w:val="center"/>
-            <w:shd w:fill="F8FAFA"/>
+            <w:shd w:fill="F5F1EA"/>
             <w:tcMar>
               <w:top w:w="75" w:type="dxa"/>
               <w:left w:w="75" w:type="dxa"/>
@@ -4476,9 +4621,10 @@
             <w:r>
               <w:rPr>
                 <w:b w:val="0"/>
+                <w:color w:val="1C1F22"/>
                 <w:sz w:val="17"/>
               </w:rPr>
-              <w:t>Runnable local prototype, synthetic booking checks and genuine interface capture.</w:t>
+              <w:t>Local demo, tour authoring, private questions, regression checks and genuine browser captures.</w:t>
             </w:r>
           </w:p>
         </w:tc>
@@ -4486,7 +4632,7 @@
           <w:tcPr>
             <w:tcW w:type="dxa" w:w="3551"/>
             <w:vAlign w:val="center"/>
-            <w:shd w:fill="F8FAFA"/>
+            <w:shd w:fill="F5F1EA"/>
             <w:tcMar>
               <w:top w:w="75" w:type="dxa"/>
               <w:left w:w="75" w:type="dxa"/>
@@ -4501,6 +4647,7 @@
             <w:r>
               <w:rPr>
                 <w:b w:val="0"/>
+                <w:color w:val="1C1F22"/>
                 <w:sz w:val="17"/>
               </w:rPr>
               <w:t>No production payment, live AI, real booking or real-user study.</w:t>
@@ -4516,7 +4663,7 @@
           <w:tcPr>
             <w:tcW w:type="dxa" w:w="2466"/>
             <w:vAlign w:val="center"/>
-            <w:shd w:fill="FFFFFF"/>
+            <w:shd w:fill="FDFBF7"/>
             <w:tcMar>
               <w:top w:w="75" w:type="dxa"/>
               <w:left w:w="75" w:type="dxa"/>
@@ -4531,6 +4678,7 @@
             <w:r>
               <w:rPr>
                 <w:b w:val="0"/>
+                <w:color w:val="1C1F22"/>
                 <w:sz w:val="17"/>
               </w:rPr>
               <w:t>Spreadsheets capability</w:t>
@@ -4541,7 +4689,7 @@
           <w:tcPr>
             <w:tcW w:type="dxa" w:w="3847"/>
             <w:vAlign w:val="center"/>
-            <w:shd w:fill="FFFFFF"/>
+            <w:shd w:fill="FDFBF7"/>
             <w:tcMar>
               <w:top w:w="75" w:type="dxa"/>
               <w:left w:w="75" w:type="dxa"/>
@@ -4556,6 +4704,7 @@
             <w:r>
               <w:rPr>
                 <w:b w:val="0"/>
+                <w:color w:val="1C1F22"/>
                 <w:sz w:val="17"/>
               </w:rPr>
               <w:t>Editable workbook and reproducible 24-month base/downside calculations.</w:t>
@@ -4566,7 +4715,7 @@
           <w:tcPr>
             <w:tcW w:type="dxa" w:w="3551"/>
             <w:vAlign w:val="center"/>
-            <w:shd w:fill="FFFFFF"/>
+            <w:shd w:fill="FDFBF7"/>
             <w:tcMar>
               <w:top w:w="75" w:type="dxa"/>
               <w:left w:w="75" w:type="dxa"/>
@@ -4581,6 +4730,7 @@
             <w:r>
               <w:rPr>
                 <w:b w:val="0"/>
+                <w:color w:val="1C1F22"/>
                 <w:sz w:val="17"/>
               </w:rPr>
               <w:t>Inputs remain planning assumptions, not observed financial results.</w:t>
@@ -4596,7 +4746,7 @@
           <w:tcPr>
             <w:tcW w:type="dxa" w:w="2466"/>
             <w:vAlign w:val="center"/>
-            <w:shd w:fill="F8FAFA"/>
+            <w:shd w:fill="F5F1EA"/>
             <w:tcMar>
               <w:top w:w="75" w:type="dxa"/>
               <w:left w:w="75" w:type="dxa"/>
@@ -4611,6 +4761,7 @@
             <w:r>
               <w:rPr>
                 <w:b w:val="0"/>
+                <w:color w:val="1C1F22"/>
                 <w:sz w:val="17"/>
               </w:rPr>
               <w:t>Documents and PDF skills</w:t>
@@ -4621,7 +4772,7 @@
           <w:tcPr>
             <w:tcW w:type="dxa" w:w="3847"/>
             <w:vAlign w:val="center"/>
-            <w:shd w:fill="F8FAFA"/>
+            <w:shd w:fill="F5F1EA"/>
             <w:tcMar>
               <w:top w:w="75" w:type="dxa"/>
               <w:left w:w="75" w:type="dxa"/>
@@ -4636,9 +4787,10 @@
             <w:r>
               <w:rPr>
                 <w:b w:val="0"/>
+                <w:color w:val="1C1F22"/>
                 <w:sz w:val="17"/>
               </w:rPr>
-              <w:t>English source, editable DOCX and an independently rendered PDF.</w:t>
+              <w:t>Updated English report, editable Word document and independently rendered PDF.</w:t>
             </w:r>
           </w:p>
         </w:tc>
@@ -4646,7 +4798,7 @@
           <w:tcPr>
             <w:tcW w:type="dxa" w:w="3551"/>
             <w:vAlign w:val="center"/>
-            <w:shd w:fill="F8FAFA"/>
+            <w:shd w:fill="F5F1EA"/>
             <w:tcMar>
               <w:top w:w="75" w:type="dxa"/>
               <w:left w:w="75" w:type="dxa"/>
@@ -4661,6 +4813,7 @@
             <w:r>
               <w:rPr>
                 <w:b w:val="0"/>
+                <w:color w:val="1C1F22"/>
                 <w:sz w:val="17"/>
               </w:rPr>
               <w:t>PDF pages visually inspected. DOCX pagination unverified: packaged renderer lacks LibreOffice.</w:t>
@@ -4676,7 +4829,7 @@
           <w:tcPr>
             <w:tcW w:type="dxa" w:w="2466"/>
             <w:vAlign w:val="center"/>
-            <w:shd w:fill="FFFFFF"/>
+            <w:shd w:fill="FDFBF7"/>
             <w:tcMar>
               <w:top w:w="75" w:type="dxa"/>
               <w:left w:w="75" w:type="dxa"/>
@@ -4691,6 +4844,7 @@
             <w:r>
               <w:rPr>
                 <w:b w:val="0"/>
+                <w:color w:val="1C1F22"/>
                 <w:sz w:val="17"/>
               </w:rPr>
               <w:t>GitHub and authorized Git tools</w:t>
@@ -4701,7 +4855,7 @@
           <w:tcPr>
             <w:tcW w:type="dxa" w:w="3847"/>
             <w:vAlign w:val="center"/>
-            <w:shd w:fill="FFFFFF"/>
+            <w:shd w:fill="FDFBF7"/>
             <w:tcMar>
               <w:top w:w="75" w:type="dxa"/>
               <w:left w:w="75" w:type="dxa"/>
@@ -4716,6 +4870,7 @@
             <w:r>
               <w:rPr>
                 <w:b w:val="0"/>
+                <w:color w:val="1C1F22"/>
                 <w:sz w:val="17"/>
               </w:rPr>
               <w:t>Repository inspection and authorized delivery workflow, reported separately.</w:t>
@@ -4726,7 +4881,7 @@
           <w:tcPr>
             <w:tcW w:type="dxa" w:w="3551"/>
             <w:vAlign w:val="center"/>
-            <w:shd w:fill="FFFFFF"/>
+            <w:shd w:fill="FDFBF7"/>
             <w:tcMar>
               <w:top w:w="75" w:type="dxa"/>
               <w:left w:w="75" w:type="dxa"/>
@@ -4741,6 +4896,7 @@
             <w:r>
               <w:rPr>
                 <w:b w:val="0"/>
+                <w:color w:val="1C1F22"/>
                 <w:sz w:val="17"/>
               </w:rPr>
               <w:t>No deployment or competition submission is authorized by a repository push.</w:t>
@@ -4816,7 +4972,7 @@
       <w:rPr>
         <w:sz w:val="16"/>
       </w:rPr>
-      <w:t xml:space="preserve">QazaqPass working draft | </w:t>
+      <w:t xml:space="preserve">Saryarqa Routes | Samal Journeys | AI-assisted draft | </w:t>
     </w:r>
     <w:fldSimple w:instr="PAGE"/>
   </w:p>
@@ -5254,11 +5410,11 @@
       <w:outlineLvl w:val="0"/>
     </w:pPr>
     <w:rPr>
-      <w:rFonts w:asciiTheme="majorHAnsi" w:eastAsiaTheme="majorEastAsia" w:hAnsiTheme="majorHAnsi" w:cstheme="majorBidi" w:ascii="Arial" w:hAnsi="Arial"/>
+      <w:rFonts w:asciiTheme="majorHAnsi" w:eastAsiaTheme="majorEastAsia" w:hAnsiTheme="majorHAnsi" w:cstheme="majorBidi" w:ascii="Georgia" w:hAnsi="Georgia"/>
       <w:b/>
       <w:bCs/>
       <w:color w:val="000000"/>
-      <w:sz w:val="32"/>
+      <w:sz w:val="34"/>
       <w:szCs w:val="28"/>
     </w:rPr>
   </w:style>
@@ -5543,11 +5699,11 @@
       <w:contextualSpacing/>
     </w:pPr>
     <w:rPr>
-      <w:rFonts w:asciiTheme="majorHAnsi" w:eastAsiaTheme="majorEastAsia" w:hAnsiTheme="majorHAnsi" w:cstheme="majorBidi" w:ascii="Arial" w:hAnsi="Arial"/>
+      <w:rFonts w:asciiTheme="majorHAnsi" w:eastAsiaTheme="majorEastAsia" w:hAnsiTheme="majorHAnsi" w:cstheme="majorBidi" w:ascii="Georgia" w:hAnsi="Georgia"/>
       <w:color w:val="000000"/>
       <w:spacing w:val="5"/>
       <w:kern w:val="28"/>
-      <w:sz w:val="42"/>
+      <w:sz w:val="50"/>
       <w:szCs w:val="52"/>
     </w:rPr>
   </w:style>
@@ -5578,12 +5734,13 @@
       <w:numPr>
         <w:ilvl w:val="1"/>
       </w:numPr>
+      <w:spacing w:after="120"/>
     </w:pPr>
     <w:rPr>
-      <w:rFonts w:asciiTheme="majorHAnsi" w:eastAsiaTheme="majorEastAsia" w:hAnsiTheme="majorHAnsi" w:cstheme="majorBidi"/>
+      <w:rFonts w:asciiTheme="majorHAnsi" w:eastAsiaTheme="majorEastAsia" w:hAnsiTheme="majorHAnsi" w:cstheme="majorBidi" w:ascii="Arial" w:hAnsi="Arial"/>
       <w:i/>
       <w:iCs/>
-      <w:color w:val="4F81BD" w:themeColor="accent1"/>
+      <w:color w:val="000000"/>
       <w:spacing w:val="15"/>
       <w:sz w:val="24"/>
       <w:szCs w:val="24"/>

</xml_diff>